<commit_message>
Update report: cloud AI demo note
</commit_message>
<xml_diff>
--- a/AI超表面结构色设计_项目报告.docx
+++ b/AI超表面结构色设计_项目报告.docx
@@ -3556,13 +3556,14 @@
       <w:pPr>
         <w:ind w:firstLine="425"/>
       </w:pPr>
+      <w:r/>
       <w:r>
         <w:rPr>
           <w:rFonts w:ascii="宋体" w:hAnsi="宋体" w:eastAsia="宋体"/>
-          <w:b w:val="0"/>
+          <w:b/>
           <w:sz w:val="24"/>
         </w:rPr>
-        <w:t>B. 云端演示地址：https://metasurface-web-a5mzzj8p98wur8njywdxat.streamlit.app/</w:t>
+        <w:t>C. 云端演示地址（含 AI 分析功能）：</w:t>
       </w:r>
     </w:p>
     <w:p>
@@ -3615,6 +3616,33 @@
           <w:sz w:val="24"/>
         </w:rPr>
         <w:t xml:space="preserve">    [3] CIE 015:2018, "Colorimetry, 4th Edition." CIE Central Bureau, Vienna (2018).</w:t>
+      </w:r>
+    </w:p>
+    <w:p/>
+    <w:p>
+      <w:pPr>
+        <w:ind w:firstLine="425"/>
+      </w:pPr>
+      <w:r>
+        <w:rPr>
+          <w:rFonts w:ascii="宋体" w:hAnsi="宋体" w:eastAsia="宋体"/>
+          <w:b w:val="0"/>
+          <w:sz w:val="24"/>
+        </w:rPr>
+        <w:t>https://metasurface-web-a5mzzj8p98wur8njywdxat.streamlit.app/</w:t>
+      </w:r>
+    </w:p>
+    <w:p>
+      <w:pPr>
+        <w:ind w:firstLine="425"/>
+      </w:pPr>
+      <w:r>
+        <w:rPr>
+          <w:rFonts w:ascii="宋体" w:hAnsi="宋体" w:eastAsia="宋体"/>
+          <w:b w:val="0"/>
+          <w:sz w:val="24"/>
+        </w:rPr>
+        <w:t>（已预配置 DeepSeek API 密钥，点击界面上方"AI 分析"按钮即可体验大模型功能。）</w:t>
       </w:r>
     </w:p>
     <w:sectPr>

</xml_diff>

<commit_message>
Regenerate report with polished layout
</commit_message>
<xml_diff>
--- a/AI超表面结构色设计_项目报告.docx
+++ b/AI超表面结构色设计_项目报告.docx
@@ -2,6 +2,8 @@
 <file path=word/document.xml><?xml version="1.0" encoding="utf-8"?>
 <w:document xmlns:wpc="http://schemas.microsoft.com/office/word/2010/wordprocessingCanvas" xmlns:mo="http://schemas.microsoft.com/office/mac/office/2008/main" xmlns:mc="http://schemas.openxmlformats.org/markup-compatibility/2006" xmlns:mv="urn:schemas-microsoft-com:mac:vml" xmlns:o="urn:schemas-microsoft-com:office:office" xmlns:r="http://schemas.openxmlformats.org/officeDocument/2006/relationships" xmlns:m="http://schemas.openxmlformats.org/officeDocument/2006/math" xmlns:v="urn:schemas-microsoft-com:vml" xmlns:wp14="http://schemas.microsoft.com/office/word/2010/wordprocessingDrawing" xmlns:wp="http://schemas.openxmlformats.org/drawingml/2006/wordprocessingDrawing" xmlns:w10="urn:schemas-microsoft-com:office:word" xmlns:w="http://schemas.openxmlformats.org/wordprocessingml/2006/main" xmlns:w14="http://schemas.microsoft.com/office/word/2010/wordml" xmlns:wpg="http://schemas.microsoft.com/office/word/2010/wordprocessingGroup" xmlns:wpi="http://schemas.microsoft.com/office/word/2010/wordprocessingInk" xmlns:wne="http://schemas.microsoft.com/office/word/2006/wordml" xmlns:wps="http://schemas.microsoft.com/office/word/2010/wordprocessingShape" mc:Ignorable="w14 wp14">
   <w:body>
+    <w:p/>
+    <w:p/>
     <w:p/>
     <w:p/>
     <w:p>
@@ -30,6 +32,7 @@
         <w:t>AI 超表面结构色智能设计系统</w:t>
       </w:r>
     </w:p>
+    <w:p/>
     <w:p/>
     <w:p/>
     <w:p>
@@ -133,7 +136,8 @@
     </w:p>
     <w:p>
       <w:pPr>
-        <w:ind w:firstLine="425"/>
+        <w:spacing w:line="360" w:lineRule="auto"/>
+        <w:ind w:firstLine="420"/>
       </w:pPr>
       <w:r>
         <w:rPr>
@@ -141,12 +145,13 @@
           <w:b w:val="0"/>
           <w:sz w:val="24"/>
         </w:rPr>
-        <w:t>超表面（Metasurface）是一种由亚波长纳米结构阵列组成的人工电磁材料，通过精确调控纳米柱的几何参数（直径D、高度H、周期P），可以在可见光波段实现丰富的结构色。与传统化学染料相比，结构色具有永不褪色、环保无毒、分辨率极高等优势，在高端显示、防伪标签、光学加密等领域具有广阔应用前景。</w:t>
+        <w:t>超表面（Metasurface）是一种由亚波长纳米结构阵列组成的人工电磁材料，通过精确调控纳米柱的几何参数（直径D、高度H、周期P），可以在可见光波段实现丰富的结构色。与传统化学染料相比，结构色具有永不褶色、环保无毒、分辨率极高等优势，在高端显示、防伪标签、光学加密等领域具有广阔应用前景。</w:t>
       </w:r>
     </w:p>
     <w:p>
       <w:pPr>
-        <w:ind w:firstLine="425"/>
+        <w:spacing w:line="360" w:lineRule="auto"/>
+        <w:ind w:firstLine="420"/>
       </w:pPr>
       <w:r>
         <w:rPr>
@@ -154,7 +159,7 @@
           <w:b w:val="0"/>
           <w:sz w:val="24"/>
         </w:rPr>
-        <w:t>然而，超表面结构色的设计面临重大挑战：纳米柱几何参数与最终呈现颜色之间存在高度非线性的映射关系，传统方法依赖电磁仿真软件（如FDTD、RCWA）进行逐点扫描，单次仿真耗时数分钟至数小时，无法满足实时交互式设计的需求。本项目利用深度学习技术构建代理模型，结合物理建模和大语言模型智能分析，实现秒级超表面结构色正向预测与逆向设计。</w:t>
+        <w:t>然而，超表面结构色的设计面临重大挑战：纳米柱几何参数与最终呈现颜色之间存在高度非线性的映射关系，传统方法依赖电磁仿真软件进行逐点扫描，单次仿真耗时数分钟至数小时，无法满足实时交互式设计的需求。本项目利用深度学习技术构建代理模型，结合物理建模和大语言模型智能分析，实现秒级超表面结构色正向预测与逆向设计。</w:t>
       </w:r>
     </w:p>
     <w:p>
@@ -170,7 +175,8 @@
     </w:p>
     <w:p>
       <w:pPr>
-        <w:ind w:firstLine="425"/>
+        <w:spacing w:line="360" w:lineRule="auto"/>
+        <w:ind w:firstLine="420"/>
       </w:pPr>
       <w:r>
         <w:rPr>
@@ -189,23 +195,26 @@
         <w:tblLook w:firstColumn="1" w:firstRow="1" w:lastColumn="0" w:lastRow="0" w:noHBand="0" w:noVBand="1" w:val="04A0"/>
       </w:tblPr>
       <w:tblGrid>
-        <w:gridCol w:w="3135"/>
-        <w:gridCol w:w="3135"/>
-        <w:gridCol w:w="3135"/>
+        <w:gridCol w:w="2878"/>
+        <w:gridCol w:w="2878"/>
+        <w:gridCol w:w="2878"/>
       </w:tblGrid>
       <w:tr>
         <w:tc>
           <w:tcPr>
-            <w:tcW w:type="dxa" w:w="3135"/>
+            <w:tcW w:type="dxa" w:w="2878"/>
+            <w:shd w:fill="D9E2F3"/>
           </w:tcPr>
           <w:p>
             <w:pPr>
               <w:jc w:val="center"/>
             </w:pPr>
+            <w:r/>
             <w:r>
               <w:rPr>
+                <w:rFonts w:ascii="宋体" w:hAnsi="宋体" w:eastAsia="宋体"/>
                 <w:b/>
-                <w:sz w:val="20"/>
+                <w:sz w:val="21"/>
               </w:rPr>
               <w:t>指标</w:t>
             </w:r>
@@ -213,16 +222,19 @@
         </w:tc>
         <w:tc>
           <w:tcPr>
-            <w:tcW w:type="dxa" w:w="3135"/>
+            <w:tcW w:type="dxa" w:w="2878"/>
+            <w:shd w:fill="D9E2F3"/>
           </w:tcPr>
           <w:p>
             <w:pPr>
               <w:jc w:val="center"/>
             </w:pPr>
+            <w:r/>
             <w:r>
               <w:rPr>
+                <w:rFonts w:ascii="宋体" w:hAnsi="宋体" w:eastAsia="宋体"/>
                 <w:b/>
-                <w:sz w:val="20"/>
+                <w:sz w:val="21"/>
               </w:rPr>
               <w:t>目标值</w:t>
             </w:r>
@@ -230,16 +242,19 @@
         </w:tc>
         <w:tc>
           <w:tcPr>
-            <w:tcW w:type="dxa" w:w="3135"/>
+            <w:tcW w:type="dxa" w:w="2878"/>
+            <w:shd w:fill="D9E2F3"/>
           </w:tcPr>
           <w:p>
             <w:pPr>
               <w:jc w:val="center"/>
             </w:pPr>
+            <w:r/>
             <w:r>
               <w:rPr>
+                <w:rFonts w:ascii="宋体" w:hAnsi="宋体" w:eastAsia="宋体"/>
                 <w:b/>
-                <w:sz w:val="20"/>
+                <w:sz w:val="21"/>
               </w:rPr>
               <w:t>实际达成</w:t>
             </w:r>
@@ -249,12 +264,17 @@
       <w:tr>
         <w:tc>
           <w:tcPr>
-            <w:tcW w:type="dxa" w:w="3135"/>
+            <w:tcW w:type="dxa" w:w="2878"/>
           </w:tcPr>
           <w:p>
+            <w:pPr>
+              <w:jc w:val="center"/>
+            </w:pPr>
+            <w:r/>
             <w:r>
               <w:rPr>
-                <w:sz w:val="20"/>
+                <w:rFonts w:ascii="宋体" w:hAnsi="宋体" w:eastAsia="宋体"/>
+                <w:sz w:val="21"/>
               </w:rPr>
               <w:t>单柱正向预测色差 ΔE2000</w:t>
             </w:r>
@@ -262,12 +282,17 @@
         </w:tc>
         <w:tc>
           <w:tcPr>
-            <w:tcW w:type="dxa" w:w="3135"/>
+            <w:tcW w:type="dxa" w:w="2878"/>
           </w:tcPr>
           <w:p>
+            <w:pPr>
+              <w:jc w:val="center"/>
+            </w:pPr>
+            <w:r/>
             <w:r>
               <w:rPr>
-                <w:sz w:val="20"/>
+                <w:rFonts w:ascii="宋体" w:hAnsi="宋体" w:eastAsia="宋体"/>
+                <w:sz w:val="21"/>
               </w:rPr>
               <w:t>≤ 3.0</w:t>
             </w:r>
@@ -275,12 +300,17 @@
         </w:tc>
         <w:tc>
           <w:tcPr>
-            <w:tcW w:type="dxa" w:w="3135"/>
+            <w:tcW w:type="dxa" w:w="2878"/>
           </w:tcPr>
           <w:p>
+            <w:pPr>
+              <w:jc w:val="center"/>
+            </w:pPr>
+            <w:r/>
             <w:r>
               <w:rPr>
-                <w:sz w:val="20"/>
+                <w:rFonts w:ascii="宋体" w:hAnsi="宋体" w:eastAsia="宋体"/>
+                <w:sz w:val="21"/>
               </w:rPr>
               <w:t>2.8（ML模型），&lt; 0.5（物理模型）</w:t>
             </w:r>
@@ -290,12 +320,17 @@
       <w:tr>
         <w:tc>
           <w:tcPr>
-            <w:tcW w:type="dxa" w:w="3135"/>
+            <w:tcW w:type="dxa" w:w="2878"/>
           </w:tcPr>
           <w:p>
+            <w:pPr>
+              <w:jc w:val="center"/>
+            </w:pPr>
+            <w:r/>
             <w:r>
               <w:rPr>
-                <w:sz w:val="20"/>
+                <w:rFonts w:ascii="宋体" w:hAnsi="宋体" w:eastAsia="宋体"/>
+                <w:sz w:val="21"/>
               </w:rPr>
               <w:t>推理速度</w:t>
             </w:r>
@@ -303,12 +338,17 @@
         </w:tc>
         <w:tc>
           <w:tcPr>
-            <w:tcW w:type="dxa" w:w="3135"/>
+            <w:tcW w:type="dxa" w:w="2878"/>
           </w:tcPr>
           <w:p>
+            <w:pPr>
+              <w:jc w:val="center"/>
+            </w:pPr>
+            <w:r/>
             <w:r>
               <w:rPr>
-                <w:sz w:val="20"/>
+                <w:rFonts w:ascii="宋体" w:hAnsi="宋体" w:eastAsia="宋体"/>
+                <w:sz w:val="21"/>
               </w:rPr>
               <w:t>≤ 100 ms/次</w:t>
             </w:r>
@@ -316,12 +356,17 @@
         </w:tc>
         <w:tc>
           <w:tcPr>
-            <w:tcW w:type="dxa" w:w="3135"/>
+            <w:tcW w:type="dxa" w:w="2878"/>
           </w:tcPr>
           <w:p>
+            <w:pPr>
+              <w:jc w:val="center"/>
+            </w:pPr>
+            <w:r/>
             <w:r>
               <w:rPr>
-                <w:sz w:val="20"/>
+                <w:rFonts w:ascii="宋体" w:hAnsi="宋体" w:eastAsia="宋体"/>
+                <w:sz w:val="21"/>
               </w:rPr>
               <w:t>&lt; 5 ms/次（ONNX Runtime）</w:t>
             </w:r>
@@ -331,12 +376,17 @@
       <w:tr>
         <w:tc>
           <w:tcPr>
-            <w:tcW w:type="dxa" w:w="3135"/>
+            <w:tcW w:type="dxa" w:w="2878"/>
           </w:tcPr>
           <w:p>
+            <w:pPr>
+              <w:jc w:val="center"/>
+            </w:pPr>
+            <w:r/>
             <w:r>
               <w:rPr>
-                <w:sz w:val="20"/>
+                <w:rFonts w:ascii="宋体" w:hAnsi="宋体" w:eastAsia="宋体"/>
+                <w:sz w:val="21"/>
               </w:rPr>
               <w:t>双柱结构支持</w:t>
             </w:r>
@@ -344,12 +394,17 @@
         </w:tc>
         <w:tc>
           <w:tcPr>
-            <w:tcW w:type="dxa" w:w="3135"/>
+            <w:tcW w:type="dxa" w:w="2878"/>
           </w:tcPr>
           <w:p>
+            <w:pPr>
+              <w:jc w:val="center"/>
+            </w:pPr>
+            <w:r/>
             <w:r>
               <w:rPr>
-                <w:sz w:val="20"/>
+                <w:rFonts w:ascii="宋体" w:hAnsi="宋体" w:eastAsia="宋体"/>
+                <w:sz w:val="21"/>
               </w:rPr>
               <w:t>支持</w:t>
             </w:r>
@@ -357,12 +412,17 @@
         </w:tc>
         <w:tc>
           <w:tcPr>
-            <w:tcW w:type="dxa" w:w="3135"/>
+            <w:tcW w:type="dxa" w:w="2878"/>
           </w:tcPr>
           <w:p>
+            <w:pPr>
+              <w:jc w:val="center"/>
+            </w:pPr>
+            <w:r/>
             <w:r>
               <w:rPr>
-                <w:sz w:val="20"/>
+                <w:rFonts w:ascii="宋体" w:hAnsi="宋体" w:eastAsia="宋体"/>
+                <w:sz w:val="21"/>
               </w:rPr>
               <w:t>支持（双Lorentzian ED+MD共振叠加）</w:t>
             </w:r>
@@ -372,12 +432,17 @@
       <w:tr>
         <w:tc>
           <w:tcPr>
-            <w:tcW w:type="dxa" w:w="3135"/>
+            <w:tcW w:type="dxa" w:w="2878"/>
           </w:tcPr>
           <w:p>
+            <w:pPr>
+              <w:jc w:val="center"/>
+            </w:pPr>
+            <w:r/>
             <w:r>
               <w:rPr>
-                <w:sz w:val="20"/>
+                <w:rFonts w:ascii="宋体" w:hAnsi="宋体" w:eastAsia="宋体"/>
+                <w:sz w:val="21"/>
               </w:rPr>
               <w:t>逆设计匹配精度</w:t>
             </w:r>
@@ -385,12 +450,17 @@
         </w:tc>
         <w:tc>
           <w:tcPr>
-            <w:tcW w:type="dxa" w:w="3135"/>
+            <w:tcW w:type="dxa" w:w="2878"/>
           </w:tcPr>
           <w:p>
+            <w:pPr>
+              <w:jc w:val="center"/>
+            </w:pPr>
+            <w:r/>
             <w:r>
               <w:rPr>
-                <w:sz w:val="20"/>
+                <w:rFonts w:ascii="宋体" w:hAnsi="宋体" w:eastAsia="宋体"/>
+                <w:sz w:val="21"/>
               </w:rPr>
               <w:t>ΔE2000 ≤ 5</w:t>
             </w:r>
@@ -398,14 +468,19 @@
         </w:tc>
         <w:tc>
           <w:tcPr>
-            <w:tcW w:type="dxa" w:w="3135"/>
+            <w:tcW w:type="dxa" w:w="2878"/>
           </w:tcPr>
           <w:p>
+            <w:pPr>
+              <w:jc w:val="center"/>
+            </w:pPr>
+            <w:r/>
             <w:r>
               <w:rPr>
-                <w:sz w:val="20"/>
+                <w:rFonts w:ascii="宋体" w:hAnsi="宋体" w:eastAsia="宋体"/>
+                <w:sz w:val="21"/>
               </w:rPr>
-              <w:t>网格搜索可达 ΔE2000 ≈ 2-10</w:t>
+              <w:t>网格搜索可达 ΔE2000 2-10</w:t>
             </w:r>
           </w:p>
         </w:tc>
@@ -413,12 +488,17 @@
       <w:tr>
         <w:tc>
           <w:tcPr>
-            <w:tcW w:type="dxa" w:w="3135"/>
+            <w:tcW w:type="dxa" w:w="2878"/>
           </w:tcPr>
           <w:p>
+            <w:pPr>
+              <w:jc w:val="center"/>
+            </w:pPr>
+            <w:r/>
             <w:r>
               <w:rPr>
-                <w:sz w:val="20"/>
+                <w:rFonts w:ascii="宋体" w:hAnsi="宋体" w:eastAsia="宋体"/>
+                <w:sz w:val="21"/>
               </w:rPr>
               <w:t>FP腔模式</w:t>
             </w:r>
@@ -426,12 +506,17 @@
         </w:tc>
         <w:tc>
           <w:tcPr>
-            <w:tcW w:type="dxa" w:w="3135"/>
+            <w:tcW w:type="dxa" w:w="2878"/>
           </w:tcPr>
           <w:p>
+            <w:pPr>
+              <w:jc w:val="center"/>
+            </w:pPr>
+            <w:r/>
             <w:r>
               <w:rPr>
-                <w:sz w:val="20"/>
+                <w:rFonts w:ascii="宋体" w:hAnsi="宋体" w:eastAsia="宋体"/>
+                <w:sz w:val="21"/>
               </w:rPr>
               <w:t>支持</w:t>
             </w:r>
@@ -439,12 +524,17 @@
         </w:tc>
         <w:tc>
           <w:tcPr>
-            <w:tcW w:type="dxa" w:w="3135"/>
+            <w:tcW w:type="dxa" w:w="2878"/>
           </w:tcPr>
           <w:p>
+            <w:pPr>
+              <w:jc w:val="center"/>
+            </w:pPr>
+            <w:r/>
             <w:r>
               <w:rPr>
-                <w:sz w:val="20"/>
+                <w:rFonts w:ascii="宋体" w:hAnsi="宋体" w:eastAsia="宋体"/>
+                <w:sz w:val="21"/>
               </w:rPr>
               <w:t>支持（DBR + 金属反射镜）</w:t>
             </w:r>
@@ -454,12 +544,17 @@
       <w:tr>
         <w:tc>
           <w:tcPr>
-            <w:tcW w:type="dxa" w:w="3135"/>
+            <w:tcW w:type="dxa" w:w="2878"/>
           </w:tcPr>
           <w:p>
+            <w:pPr>
+              <w:jc w:val="center"/>
+            </w:pPr>
+            <w:r/>
             <w:r>
               <w:rPr>
-                <w:sz w:val="20"/>
+                <w:rFonts w:ascii="宋体" w:hAnsi="宋体" w:eastAsia="宋体"/>
+                <w:sz w:val="21"/>
               </w:rPr>
               <w:t>大模型集成</w:t>
             </w:r>
@@ -467,12 +562,17 @@
         </w:tc>
         <w:tc>
           <w:tcPr>
-            <w:tcW w:type="dxa" w:w="3135"/>
+            <w:tcW w:type="dxa" w:w="2878"/>
           </w:tcPr>
           <w:p>
+            <w:pPr>
+              <w:jc w:val="center"/>
+            </w:pPr>
+            <w:r/>
             <w:r>
               <w:rPr>
-                <w:sz w:val="20"/>
+                <w:rFonts w:ascii="宋体" w:hAnsi="宋体" w:eastAsia="宋体"/>
+                <w:sz w:val="21"/>
               </w:rPr>
               <w:t>支持</w:t>
             </w:r>
@@ -480,12 +580,17 @@
         </w:tc>
         <w:tc>
           <w:tcPr>
-            <w:tcW w:type="dxa" w:w="3135"/>
+            <w:tcW w:type="dxa" w:w="2878"/>
           </w:tcPr>
           <w:p>
+            <w:pPr>
+              <w:jc w:val="center"/>
+            </w:pPr>
+            <w:r/>
             <w:r>
               <w:rPr>
-                <w:sz w:val="20"/>
+                <w:rFonts w:ascii="宋体" w:hAnsi="宋体" w:eastAsia="宋体"/>
+                <w:sz w:val="21"/>
               </w:rPr>
               <w:t>DeepSeek API 智能色彩分析</w:t>
             </w:r>
@@ -513,23 +618,26 @@
         <w:tblLook w:firstColumn="1" w:firstRow="1" w:lastColumn="0" w:lastRow="0" w:noHBand="0" w:noVBand="1" w:val="04A0"/>
       </w:tblPr>
       <w:tblGrid>
-        <w:gridCol w:w="3135"/>
-        <w:gridCol w:w="3135"/>
-        <w:gridCol w:w="3135"/>
+        <w:gridCol w:w="2878"/>
+        <w:gridCol w:w="2878"/>
+        <w:gridCol w:w="2878"/>
       </w:tblGrid>
       <w:tr>
         <w:tc>
           <w:tcPr>
-            <w:tcW w:type="dxa" w:w="3135"/>
+            <w:tcW w:type="dxa" w:w="2878"/>
+            <w:shd w:fill="D9E2F3"/>
           </w:tcPr>
           <w:p>
             <w:pPr>
               <w:jc w:val="center"/>
             </w:pPr>
+            <w:r/>
             <w:r>
               <w:rPr>
+                <w:rFonts w:ascii="宋体" w:hAnsi="宋体" w:eastAsia="宋体"/>
                 <w:b/>
-                <w:sz w:val="20"/>
+                <w:sz w:val="21"/>
               </w:rPr>
               <w:t>成员</w:t>
             </w:r>
@@ -537,16 +645,19 @@
         </w:tc>
         <w:tc>
           <w:tcPr>
-            <w:tcW w:type="dxa" w:w="3135"/>
+            <w:tcW w:type="dxa" w:w="2878"/>
+            <w:shd w:fill="D9E2F3"/>
           </w:tcPr>
           <w:p>
             <w:pPr>
               <w:jc w:val="center"/>
             </w:pPr>
+            <w:r/>
             <w:r>
               <w:rPr>
+                <w:rFonts w:ascii="宋体" w:hAnsi="宋体" w:eastAsia="宋体"/>
                 <w:b/>
-                <w:sz w:val="20"/>
+                <w:sz w:val="21"/>
               </w:rPr>
               <w:t>角色</w:t>
             </w:r>
@@ -554,16 +665,19 @@
         </w:tc>
         <w:tc>
           <w:tcPr>
-            <w:tcW w:type="dxa" w:w="3135"/>
+            <w:tcW w:type="dxa" w:w="2878"/>
+            <w:shd w:fill="D9E2F3"/>
           </w:tcPr>
           <w:p>
             <w:pPr>
               <w:jc w:val="center"/>
             </w:pPr>
+            <w:r/>
             <w:r>
               <w:rPr>
+                <w:rFonts w:ascii="宋体" w:hAnsi="宋体" w:eastAsia="宋体"/>
                 <w:b/>
-                <w:sz w:val="20"/>
+                <w:sz w:val="21"/>
               </w:rPr>
               <w:t>主要职责</w:t>
             </w:r>
@@ -573,12 +687,17 @@
       <w:tr>
         <w:tc>
           <w:tcPr>
-            <w:tcW w:type="dxa" w:w="3135"/>
+            <w:tcW w:type="dxa" w:w="2878"/>
           </w:tcPr>
           <w:p>
+            <w:pPr>
+              <w:jc w:val="center"/>
+            </w:pPr>
+            <w:r/>
             <w:r>
               <w:rPr>
-                <w:sz w:val="20"/>
+                <w:rFonts w:ascii="宋体" w:hAnsi="宋体" w:eastAsia="宋体"/>
+                <w:sz w:val="21"/>
               </w:rPr>
               <w:t>乔安琪（组长）</w:t>
             </w:r>
@@ -586,12 +705,17 @@
         </w:tc>
         <w:tc>
           <w:tcPr>
-            <w:tcW w:type="dxa" w:w="3135"/>
+            <w:tcW w:type="dxa" w:w="2878"/>
           </w:tcPr>
           <w:p>
+            <w:pPr>
+              <w:jc w:val="center"/>
+            </w:pPr>
+            <w:r/>
             <w:r>
               <w:rPr>
-                <w:sz w:val="20"/>
+                <w:rFonts w:ascii="宋体" w:hAnsi="宋体" w:eastAsia="宋体"/>
+                <w:sz w:val="21"/>
               </w:rPr>
               <w:t>项目统筹 &amp; 前端开发</w:t>
             </w:r>
@@ -599,14 +723,19 @@
         </w:tc>
         <w:tc>
           <w:tcPr>
-            <w:tcW w:type="dxa" w:w="3135"/>
+            <w:tcW w:type="dxa" w:w="2878"/>
           </w:tcPr>
           <w:p>
+            <w:pPr>
+              <w:jc w:val="center"/>
+            </w:pPr>
+            <w:r/>
             <w:r>
               <w:rPr>
-                <w:sz w:val="20"/>
+                <w:rFonts w:ascii="宋体" w:hAnsi="宋体" w:eastAsia="宋体"/>
+                <w:sz w:val="21"/>
               </w:rPr>
-              <w:t>整体架构设计、Streamlit 交互界面开发、LLM 大模型模块集成、项目报告撰写</w:t>
+              <w:t>整体架构设计、Streamlit 交互界面、LLM 大模型集成、报告撰写</w:t>
             </w:r>
           </w:p>
         </w:tc>
@@ -614,12 +743,17 @@
       <w:tr>
         <w:tc>
           <w:tcPr>
-            <w:tcW w:type="dxa" w:w="3135"/>
+            <w:tcW w:type="dxa" w:w="2878"/>
           </w:tcPr>
           <w:p>
+            <w:pPr>
+              <w:jc w:val="center"/>
+            </w:pPr>
+            <w:r/>
             <w:r>
               <w:rPr>
-                <w:sz w:val="20"/>
+                <w:rFonts w:ascii="宋体" w:hAnsi="宋体" w:eastAsia="宋体"/>
+                <w:sz w:val="21"/>
               </w:rPr>
               <w:t>谢家珞</w:t>
             </w:r>
@@ -627,12 +761,17 @@
         </w:tc>
         <w:tc>
           <w:tcPr>
-            <w:tcW w:type="dxa" w:w="3135"/>
+            <w:tcW w:type="dxa" w:w="2878"/>
           </w:tcPr>
           <w:p>
+            <w:pPr>
+              <w:jc w:val="center"/>
+            </w:pPr>
+            <w:r/>
             <w:r>
               <w:rPr>
-                <w:sz w:val="20"/>
+                <w:rFonts w:ascii="宋体" w:hAnsi="宋体" w:eastAsia="宋体"/>
+                <w:sz w:val="21"/>
               </w:rPr>
               <w:t>物理建模 &amp; 算法</w:t>
             </w:r>
@@ -640,14 +779,19 @@
         </w:tc>
         <w:tc>
           <w:tcPr>
-            <w:tcW w:type="dxa" w:w="3135"/>
+            <w:tcW w:type="dxa" w:w="2878"/>
           </w:tcPr>
           <w:p>
+            <w:pPr>
+              <w:jc w:val="center"/>
+            </w:pPr>
+            <w:r/>
             <w:r>
               <w:rPr>
-                <w:sz w:val="20"/>
+                <w:rFonts w:ascii="宋体" w:hAnsi="宋体" w:eastAsia="宋体"/>
+                <w:sz w:val="21"/>
               </w:rPr>
-              <w:t>Lorentzian/Fano 共振物理模型、FP 腔光谱建模、角谱远场传播算法、参数灵敏度分析</w:t>
+              <w:t>Lorentzian/Fano 共振模型、FP 腔光谱、角谱远场传播、参数灵敏度分析</w:t>
             </w:r>
           </w:p>
         </w:tc>
@@ -655,12 +799,17 @@
       <w:tr>
         <w:tc>
           <w:tcPr>
-            <w:tcW w:type="dxa" w:w="3135"/>
+            <w:tcW w:type="dxa" w:w="2878"/>
           </w:tcPr>
           <w:p>
+            <w:pPr>
+              <w:jc w:val="center"/>
+            </w:pPr>
+            <w:r/>
             <w:r>
               <w:rPr>
-                <w:sz w:val="20"/>
+                <w:rFonts w:ascii="宋体" w:hAnsi="宋体" w:eastAsia="宋体"/>
+                <w:sz w:val="21"/>
               </w:rPr>
               <w:t>侯琢</w:t>
             </w:r>
@@ -668,12 +817,17 @@
         </w:tc>
         <w:tc>
           <w:tcPr>
-            <w:tcW w:type="dxa" w:w="3135"/>
+            <w:tcW w:type="dxa" w:w="2878"/>
           </w:tcPr>
           <w:p>
+            <w:pPr>
+              <w:jc w:val="center"/>
+            </w:pPr>
+            <w:r/>
             <w:r>
               <w:rPr>
-                <w:sz w:val="20"/>
+                <w:rFonts w:ascii="宋体" w:hAnsi="宋体" w:eastAsia="宋体"/>
+                <w:sz w:val="21"/>
               </w:rPr>
               <w:t>ML 训练 &amp; 部署</w:t>
             </w:r>
@@ -681,19 +835,30 @@
         </w:tc>
         <w:tc>
           <w:tcPr>
-            <w:tcW w:type="dxa" w:w="3135"/>
+            <w:tcW w:type="dxa" w:w="2878"/>
           </w:tcPr>
           <w:p>
+            <w:pPr>
+              <w:jc w:val="center"/>
+            </w:pPr>
+            <w:r/>
             <w:r>
               <w:rPr>
-                <w:sz w:val="20"/>
+                <w:rFonts w:ascii="宋体" w:hAnsi="宋体" w:eastAsia="宋体"/>
+                <w:sz w:val="21"/>
               </w:rPr>
-              <w:t>MLP 神经网络训练与调优、ONNX Runtime 模型导出与部署、双柱梯度逆设计算法</w:t>
+              <w:t>MLP 训练与调优、ONNX 导出与部署、双柱梯度逆设计算法</w:t>
             </w:r>
           </w:p>
         </w:tc>
       </w:tr>
     </w:tbl>
+    <w:p/>
+    <w:p>
+      <w:r>
+        <w:br w:type="page"/>
+      </w:r>
+    </w:p>
     <w:p>
       <w:pPr>
         <w:pStyle w:val="Heading1"/>
@@ -718,7 +883,8 @@
     </w:p>
     <w:p>
       <w:pPr>
-        <w:ind w:firstLine="425"/>
+        <w:spacing w:line="360" w:lineRule="auto"/>
+        <w:ind w:firstLine="420"/>
       </w:pPr>
       <w:r>
         <w:rPr>
@@ -726,12 +892,12 @@
           <w:b w:val="0"/>
           <w:sz w:val="24"/>
         </w:rPr>
-        <w:t>系统采用 "物理模型 + 机器学习 + 大语言模型" 三层架构：</w:t>
+        <w:t>系统采用“物理模型 + 机器学习 + 大语言模型”三层架构：</w:t>
       </w:r>
     </w:p>
     <w:p>
       <w:pPr>
-        <w:ind w:firstLine="425"/>
+        <w:spacing w:line="360" w:lineRule="auto"/>
       </w:pPr>
       <w:r>
         <w:rPr>
@@ -744,7 +910,7 @@
     </w:p>
     <w:p>
       <w:pPr>
-        <w:ind w:firstLine="425"/>
+        <w:spacing w:line="360" w:lineRule="auto"/>
       </w:pPr>
       <w:r>
         <w:rPr>
@@ -757,7 +923,7 @@
     </w:p>
     <w:p>
       <w:pPr>
-        <w:ind w:firstLine="425"/>
+        <w:spacing w:line="360" w:lineRule="auto"/>
       </w:pPr>
       <w:r>
         <w:rPr>
@@ -769,17 +935,9 @@
       </w:r>
     </w:p>
     <w:p>
-      <w:r>
-        <w:rPr>
-          <w:rFonts w:ascii="宋体" w:hAnsi="宋体" w:eastAsia="宋体"/>
-          <w:b w:val="0"/>
-          <w:sz w:val="24"/>
-        </w:rPr>
-      </w:r>
-    </w:p>
-    <w:p>
       <w:pPr>
-        <w:ind w:firstLine="425"/>
+        <w:spacing w:line="360" w:lineRule="auto"/>
+        <w:ind w:firstLine="420"/>
       </w:pPr>
       <w:r>
         <w:rPr>
@@ -787,20 +945,7 @@
           <w:b w:val="0"/>
           <w:sz w:val="24"/>
         </w:rPr>
-        <w:t>系统业务流程图：</w:t>
-      </w:r>
-    </w:p>
-    <w:p>
-      <w:pPr>
-        <w:ind w:firstLine="425"/>
-      </w:pPr>
-      <w:r>
-        <w:rPr>
-          <w:rFonts w:ascii="宋体" w:hAnsi="宋体" w:eastAsia="宋体"/>
-          <w:b w:val="0"/>
-          <w:sz w:val="24"/>
-        </w:rPr>
-        <w:t>用户输入参数 → 参数预处理 → [ML代理/物理模型] 计算反射光谱 → CIE 1931 色度转换 → sRGB 颜色输出 → 可视化展示 → [LLM智能分析]</w:t>
+        <w:t>业务流程：用户输入参数 → 参数预处理 → [ML代理/物理模型] 计算反射光谱 → CIE 1931 色度转换 → sRGB 颜色输出 → 可视化展示 → [LLM智能分析]</w:t>
       </w:r>
     </w:p>
     <w:p>
@@ -822,23 +967,26 @@
         <w:tblLook w:firstColumn="1" w:firstRow="1" w:lastColumn="0" w:lastRow="0" w:noHBand="0" w:noVBand="1" w:val="04A0"/>
       </w:tblPr>
       <w:tblGrid>
-        <w:gridCol w:w="3135"/>
-        <w:gridCol w:w="3135"/>
-        <w:gridCol w:w="3135"/>
+        <w:gridCol w:w="2878"/>
+        <w:gridCol w:w="2878"/>
+        <w:gridCol w:w="2878"/>
       </w:tblGrid>
       <w:tr>
         <w:tc>
           <w:tcPr>
-            <w:tcW w:type="dxa" w:w="3135"/>
+            <w:tcW w:type="dxa" w:w="2878"/>
+            <w:shd w:fill="D9E2F3"/>
           </w:tcPr>
           <w:p>
             <w:pPr>
               <w:jc w:val="center"/>
             </w:pPr>
+            <w:r/>
             <w:r>
               <w:rPr>
+                <w:rFonts w:ascii="宋体" w:hAnsi="宋体" w:eastAsia="宋体"/>
                 <w:b/>
-                <w:sz w:val="20"/>
+                <w:sz w:val="21"/>
               </w:rPr>
               <w:t>技术</w:t>
             </w:r>
@@ -846,16 +994,19 @@
         </w:tc>
         <w:tc>
           <w:tcPr>
-            <w:tcW w:type="dxa" w:w="3135"/>
+            <w:tcW w:type="dxa" w:w="2878"/>
+            <w:shd w:fill="D9E2F3"/>
           </w:tcPr>
           <w:p>
             <w:pPr>
               <w:jc w:val="center"/>
             </w:pPr>
+            <w:r/>
             <w:r>
               <w:rPr>
+                <w:rFonts w:ascii="宋体" w:hAnsi="宋体" w:eastAsia="宋体"/>
                 <w:b/>
-                <w:sz w:val="20"/>
+                <w:sz w:val="21"/>
               </w:rPr>
               <w:t>选型</w:t>
             </w:r>
@@ -863,16 +1014,19 @@
         </w:tc>
         <w:tc>
           <w:tcPr>
-            <w:tcW w:type="dxa" w:w="3135"/>
+            <w:tcW w:type="dxa" w:w="2878"/>
+            <w:shd w:fill="D9E2F3"/>
           </w:tcPr>
           <w:p>
             <w:pPr>
               <w:jc w:val="center"/>
             </w:pPr>
+            <w:r/>
             <w:r>
               <w:rPr>
+                <w:rFonts w:ascii="宋体" w:hAnsi="宋体" w:eastAsia="宋体"/>
                 <w:b/>
-                <w:sz w:val="20"/>
+                <w:sz w:val="21"/>
               </w:rPr>
               <w:t>理由</w:t>
             </w:r>
@@ -882,12 +1036,17 @@
       <w:tr>
         <w:tc>
           <w:tcPr>
-            <w:tcW w:type="dxa" w:w="3135"/>
+            <w:tcW w:type="dxa" w:w="2878"/>
           </w:tcPr>
           <w:p>
+            <w:pPr>
+              <w:jc w:val="center"/>
+            </w:pPr>
+            <w:r/>
             <w:r>
               <w:rPr>
-                <w:sz w:val="20"/>
+                <w:rFonts w:ascii="宋体" w:hAnsi="宋体" w:eastAsia="宋体"/>
+                <w:sz w:val="21"/>
               </w:rPr>
               <w:t>编程语言</w:t>
             </w:r>
@@ -895,12 +1054,17 @@
         </w:tc>
         <w:tc>
           <w:tcPr>
-            <w:tcW w:type="dxa" w:w="3135"/>
+            <w:tcW w:type="dxa" w:w="2878"/>
           </w:tcPr>
           <w:p>
+            <w:pPr>
+              <w:jc w:val="center"/>
+            </w:pPr>
+            <w:r/>
             <w:r>
               <w:rPr>
-                <w:sz w:val="20"/>
+                <w:rFonts w:ascii="宋体" w:hAnsi="宋体" w:eastAsia="宋体"/>
+                <w:sz w:val="21"/>
               </w:rPr>
               <w:t>Python 3.10+</w:t>
             </w:r>
@@ -908,12 +1072,17 @@
         </w:tc>
         <w:tc>
           <w:tcPr>
-            <w:tcW w:type="dxa" w:w="3135"/>
+            <w:tcW w:type="dxa" w:w="2878"/>
           </w:tcPr>
           <w:p>
+            <w:pPr>
+              <w:jc w:val="center"/>
+            </w:pPr>
+            <w:r/>
             <w:r>
               <w:rPr>
-                <w:sz w:val="20"/>
+                <w:rFonts w:ascii="宋体" w:hAnsi="宋体" w:eastAsia="宋体"/>
+                <w:sz w:val="21"/>
               </w:rPr>
               <w:t>丰富的科学计算和深度学习生态</w:t>
             </w:r>
@@ -923,12 +1092,17 @@
       <w:tr>
         <w:tc>
           <w:tcPr>
-            <w:tcW w:type="dxa" w:w="3135"/>
+            <w:tcW w:type="dxa" w:w="2878"/>
           </w:tcPr>
           <w:p>
+            <w:pPr>
+              <w:jc w:val="center"/>
+            </w:pPr>
+            <w:r/>
             <w:r>
               <w:rPr>
-                <w:sz w:val="20"/>
+                <w:rFonts w:ascii="宋体" w:hAnsi="宋体" w:eastAsia="宋体"/>
+                <w:sz w:val="21"/>
               </w:rPr>
               <w:t>深度学习框架</w:t>
             </w:r>
@@ -936,12 +1110,17 @@
         </w:tc>
         <w:tc>
           <w:tcPr>
-            <w:tcW w:type="dxa" w:w="3135"/>
+            <w:tcW w:type="dxa" w:w="2878"/>
           </w:tcPr>
           <w:p>
+            <w:pPr>
+              <w:jc w:val="center"/>
+            </w:pPr>
+            <w:r/>
             <w:r>
               <w:rPr>
-                <w:sz w:val="20"/>
+                <w:rFonts w:ascii="宋体" w:hAnsi="宋体" w:eastAsia="宋体"/>
+                <w:sz w:val="21"/>
               </w:rPr>
               <w:t>PyTorch 2.x</w:t>
             </w:r>
@@ -949,12 +1128,17 @@
         </w:tc>
         <w:tc>
           <w:tcPr>
-            <w:tcW w:type="dxa" w:w="3135"/>
+            <w:tcW w:type="dxa" w:w="2878"/>
           </w:tcPr>
           <w:p>
+            <w:pPr>
+              <w:jc w:val="center"/>
+            </w:pPr>
+            <w:r/>
             <w:r>
               <w:rPr>
-                <w:sz w:val="20"/>
+                <w:rFonts w:ascii="宋体" w:hAnsi="宋体" w:eastAsia="宋体"/>
+                <w:sz w:val="21"/>
               </w:rPr>
               <w:t>灵活的动态计算图，适合研究场景</w:t>
             </w:r>
@@ -964,12 +1148,17 @@
       <w:tr>
         <w:tc>
           <w:tcPr>
-            <w:tcW w:type="dxa" w:w="3135"/>
+            <w:tcW w:type="dxa" w:w="2878"/>
           </w:tcPr>
           <w:p>
+            <w:pPr>
+              <w:jc w:val="center"/>
+            </w:pPr>
+            <w:r/>
             <w:r>
               <w:rPr>
-                <w:sz w:val="20"/>
+                <w:rFonts w:ascii="宋体" w:hAnsi="宋体" w:eastAsia="宋体"/>
+                <w:sz w:val="21"/>
               </w:rPr>
               <w:t>推理部署</w:t>
             </w:r>
@@ -977,12 +1166,17 @@
         </w:tc>
         <w:tc>
           <w:tcPr>
-            <w:tcW w:type="dxa" w:w="3135"/>
+            <w:tcW w:type="dxa" w:w="2878"/>
           </w:tcPr>
           <w:p>
+            <w:pPr>
+              <w:jc w:val="center"/>
+            </w:pPr>
+            <w:r/>
             <w:r>
               <w:rPr>
-                <w:sz w:val="20"/>
+                <w:rFonts w:ascii="宋体" w:hAnsi="宋体" w:eastAsia="宋体"/>
+                <w:sz w:val="21"/>
               </w:rPr>
               <w:t>ONNX Runtime</w:t>
             </w:r>
@@ -990,14 +1184,19 @@
         </w:tc>
         <w:tc>
           <w:tcPr>
-            <w:tcW w:type="dxa" w:w="3135"/>
+            <w:tcW w:type="dxa" w:w="2878"/>
           </w:tcPr>
           <w:p>
+            <w:pPr>
+              <w:jc w:val="center"/>
+            </w:pPr>
+            <w:r/>
             <w:r>
               <w:rPr>
-                <w:sz w:val="20"/>
+                <w:rFonts w:ascii="宋体" w:hAnsi="宋体" w:eastAsia="宋体"/>
+                <w:sz w:val="21"/>
               </w:rPr>
-              <w:t>跨平台、高性能推理，无需PyTorch依赖即可运行</w:t>
+              <w:t>跨平台、高性能推理，无需 PyTorch 依赖</w:t>
             </w:r>
           </w:p>
         </w:tc>
@@ -1005,12 +1204,17 @@
       <w:tr>
         <w:tc>
           <w:tcPr>
-            <w:tcW w:type="dxa" w:w="3135"/>
+            <w:tcW w:type="dxa" w:w="2878"/>
           </w:tcPr>
           <w:p>
+            <w:pPr>
+              <w:jc w:val="center"/>
+            </w:pPr>
+            <w:r/>
             <w:r>
               <w:rPr>
-                <w:sz w:val="20"/>
+                <w:rFonts w:ascii="宋体" w:hAnsi="宋体" w:eastAsia="宋体"/>
+                <w:sz w:val="21"/>
               </w:rPr>
               <w:t>Web 前端</w:t>
             </w:r>
@@ -1018,12 +1222,17 @@
         </w:tc>
         <w:tc>
           <w:tcPr>
-            <w:tcW w:type="dxa" w:w="3135"/>
+            <w:tcW w:type="dxa" w:w="2878"/>
           </w:tcPr>
           <w:p>
+            <w:pPr>
+              <w:jc w:val="center"/>
+            </w:pPr>
+            <w:r/>
             <w:r>
               <w:rPr>
-                <w:sz w:val="20"/>
+                <w:rFonts w:ascii="宋体" w:hAnsi="宋体" w:eastAsia="宋体"/>
+                <w:sz w:val="21"/>
               </w:rPr>
               <w:t>Streamlit</w:t>
             </w:r>
@@ -1031,14 +1240,19 @@
         </w:tc>
         <w:tc>
           <w:tcPr>
-            <w:tcW w:type="dxa" w:w="3135"/>
+            <w:tcW w:type="dxa" w:w="2878"/>
           </w:tcPr>
           <w:p>
+            <w:pPr>
+              <w:jc w:val="center"/>
+            </w:pPr>
+            <w:r/>
             <w:r>
               <w:rPr>
-                <w:sz w:val="20"/>
+                <w:rFonts w:ascii="宋体" w:hAnsi="宋体" w:eastAsia="宋体"/>
+                <w:sz w:val="21"/>
               </w:rPr>
-              <w:t>纯 Python 构建交互式Web应用，开发效率高</w:t>
+              <w:t>纯 Python 构建交互式 Web 应用</w:t>
             </w:r>
           </w:p>
         </w:tc>
@@ -1046,12 +1260,17 @@
       <w:tr>
         <w:tc>
           <w:tcPr>
-            <w:tcW w:type="dxa" w:w="3135"/>
+            <w:tcW w:type="dxa" w:w="2878"/>
           </w:tcPr>
           <w:p>
+            <w:pPr>
+              <w:jc w:val="center"/>
+            </w:pPr>
+            <w:r/>
             <w:r>
               <w:rPr>
-                <w:sz w:val="20"/>
+                <w:rFonts w:ascii="宋体" w:hAnsi="宋体" w:eastAsia="宋体"/>
+                <w:sz w:val="21"/>
               </w:rPr>
               <w:t>物理计算</w:t>
             </w:r>
@@ -1059,12 +1278,17 @@
         </w:tc>
         <w:tc>
           <w:tcPr>
-            <w:tcW w:type="dxa" w:w="3135"/>
+            <w:tcW w:type="dxa" w:w="2878"/>
           </w:tcPr>
           <w:p>
+            <w:pPr>
+              <w:jc w:val="center"/>
+            </w:pPr>
+            <w:r/>
             <w:r>
               <w:rPr>
-                <w:sz w:val="20"/>
+                <w:rFonts w:ascii="宋体" w:hAnsi="宋体" w:eastAsia="宋体"/>
+                <w:sz w:val="21"/>
               </w:rPr>
               <w:t>NumPy + SciPy</w:t>
             </w:r>
@@ -1072,12 +1296,17 @@
         </w:tc>
         <w:tc>
           <w:tcPr>
-            <w:tcW w:type="dxa" w:w="3135"/>
+            <w:tcW w:type="dxa" w:w="2878"/>
           </w:tcPr>
           <w:p>
+            <w:pPr>
+              <w:jc w:val="center"/>
+            </w:pPr>
+            <w:r/>
             <w:r>
               <w:rPr>
-                <w:sz w:val="20"/>
+                <w:rFonts w:ascii="宋体" w:hAnsi="宋体" w:eastAsia="宋体"/>
+                <w:sz w:val="21"/>
               </w:rPr>
               <w:t>高效的数值计算和插值</w:t>
             </w:r>
@@ -1087,12 +1316,17 @@
       <w:tr>
         <w:tc>
           <w:tcPr>
-            <w:tcW w:type="dxa" w:w="3135"/>
+            <w:tcW w:type="dxa" w:w="2878"/>
           </w:tcPr>
           <w:p>
+            <w:pPr>
+              <w:jc w:val="center"/>
+            </w:pPr>
+            <w:r/>
             <w:r>
               <w:rPr>
-                <w:sz w:val="20"/>
+                <w:rFonts w:ascii="宋体" w:hAnsi="宋体" w:eastAsia="宋体"/>
+                <w:sz w:val="21"/>
               </w:rPr>
               <w:t>大模型</w:t>
             </w:r>
@@ -1100,12 +1334,17 @@
         </w:tc>
         <w:tc>
           <w:tcPr>
-            <w:tcW w:type="dxa" w:w="3135"/>
+            <w:tcW w:type="dxa" w:w="2878"/>
           </w:tcPr>
           <w:p>
+            <w:pPr>
+              <w:jc w:val="center"/>
+            </w:pPr>
+            <w:r/>
             <w:r>
               <w:rPr>
-                <w:sz w:val="20"/>
+                <w:rFonts w:ascii="宋体" w:hAnsi="宋体" w:eastAsia="宋体"/>
+                <w:sz w:val="21"/>
               </w:rPr>
               <w:t>DeepSeek API</w:t>
             </w:r>
@@ -1113,12 +1352,17 @@
         </w:tc>
         <w:tc>
           <w:tcPr>
-            <w:tcW w:type="dxa" w:w="3135"/>
+            <w:tcW w:type="dxa" w:w="2878"/>
           </w:tcPr>
           <w:p>
+            <w:pPr>
+              <w:jc w:val="center"/>
+            </w:pPr>
+            <w:r/>
             <w:r>
               <w:rPr>
-                <w:sz w:val="20"/>
+                <w:rFonts w:ascii="宋体" w:hAnsi="宋体" w:eastAsia="宋体"/>
+                <w:sz w:val="21"/>
               </w:rPr>
               <w:t>国产大模型，性价比高，中文能力强</w:t>
             </w:r>
@@ -1128,12 +1372,17 @@
       <w:tr>
         <w:tc>
           <w:tcPr>
-            <w:tcW w:type="dxa" w:w="3135"/>
+            <w:tcW w:type="dxa" w:w="2878"/>
           </w:tcPr>
           <w:p>
+            <w:pPr>
+              <w:jc w:val="center"/>
+            </w:pPr>
+            <w:r/>
             <w:r>
               <w:rPr>
-                <w:sz w:val="20"/>
+                <w:rFonts w:ascii="宋体" w:hAnsi="宋体" w:eastAsia="宋体"/>
+                <w:sz w:val="21"/>
               </w:rPr>
               <w:t>部署平台</w:t>
             </w:r>
@@ -1141,32 +1390,43 @@
         </w:tc>
         <w:tc>
           <w:tcPr>
-            <w:tcW w:type="dxa" w:w="3135"/>
+            <w:tcW w:type="dxa" w:w="2878"/>
           </w:tcPr>
           <w:p>
+            <w:pPr>
+              <w:jc w:val="center"/>
+            </w:pPr>
+            <w:r/>
             <w:r>
               <w:rPr>
-                <w:sz w:val="20"/>
+                <w:rFonts w:ascii="宋体" w:hAnsi="宋体" w:eastAsia="宋体"/>
+                <w:sz w:val="21"/>
               </w:rPr>
-              <w:t>Streamlit Cloud</w:t>
+              <w:t>Streamlit Cloud + 本地</w:t>
             </w:r>
           </w:p>
         </w:tc>
         <w:tc>
           <w:tcPr>
-            <w:tcW w:type="dxa" w:w="3135"/>
+            <w:tcW w:type="dxa" w:w="2878"/>
           </w:tcPr>
           <w:p>
+            <w:pPr>
+              <w:jc w:val="center"/>
+            </w:pPr>
+            <w:r/>
             <w:r>
               <w:rPr>
-                <w:sz w:val="20"/>
+                <w:rFonts w:ascii="宋体" w:hAnsi="宋体" w:eastAsia="宋体"/>
+                <w:sz w:val="21"/>
               </w:rPr>
-              <w:t>免费托管，与GitHub无缝集成</w:t>
+              <w:t>免费托管，与 GitHub 无缝集成</w:t>
             </w:r>
           </w:p>
         </w:tc>
       </w:tr>
     </w:tbl>
+    <w:p/>
     <w:p>
       <w:pPr>
         <w:pStyle w:val="Heading2"/>
@@ -1186,24 +1446,26 @@
         <w:tblLook w:firstColumn="1" w:firstRow="1" w:lastColumn="0" w:lastRow="0" w:noHBand="0" w:noVBand="1" w:val="04A0"/>
       </w:tblPr>
       <w:tblGrid>
-        <w:gridCol w:w="2351"/>
-        <w:gridCol w:w="2351"/>
-        <w:gridCol w:w="2351"/>
-        <w:gridCol w:w="2351"/>
+        <w:gridCol w:w="2878"/>
+        <w:gridCol w:w="2878"/>
+        <w:gridCol w:w="2878"/>
       </w:tblGrid>
       <w:tr>
         <w:tc>
           <w:tcPr>
-            <w:tcW w:type="dxa" w:w="2351"/>
+            <w:tcW w:type="dxa" w:w="2878"/>
+            <w:shd w:fill="D9E2F3"/>
           </w:tcPr>
           <w:p>
             <w:pPr>
               <w:jc w:val="center"/>
             </w:pPr>
+            <w:r/>
             <w:r>
               <w:rPr>
+                <w:rFonts w:ascii="宋体" w:hAnsi="宋体" w:eastAsia="宋体"/>
                 <w:b/>
-                <w:sz w:val="20"/>
+                <w:sz w:val="21"/>
               </w:rPr>
               <w:t>模块</w:t>
             </w:r>
@@ -1211,16 +1473,19 @@
         </w:tc>
         <w:tc>
           <w:tcPr>
-            <w:tcW w:type="dxa" w:w="2351"/>
+            <w:tcW w:type="dxa" w:w="2878"/>
+            <w:shd w:fill="D9E2F3"/>
           </w:tcPr>
           <w:p>
             <w:pPr>
               <w:jc w:val="center"/>
             </w:pPr>
+            <w:r/>
             <w:r>
               <w:rPr>
+                <w:rFonts w:ascii="宋体" w:hAnsi="宋体" w:eastAsia="宋体"/>
                 <w:b/>
-                <w:sz w:val="20"/>
+                <w:sz w:val="21"/>
               </w:rPr>
               <w:t>功能</w:t>
             </w:r>
@@ -1228,33 +1493,19 @@
         </w:tc>
         <w:tc>
           <w:tcPr>
-            <w:tcW w:type="dxa" w:w="2351"/>
+            <w:tcW w:type="dxa" w:w="2878"/>
+            <w:shd w:fill="D9E2F3"/>
           </w:tcPr>
           <w:p>
             <w:pPr>
               <w:jc w:val="center"/>
             </w:pPr>
+            <w:r/>
             <w:r>
               <w:rPr>
+                <w:rFonts w:ascii="宋体" w:hAnsi="宋体" w:eastAsia="宋体"/>
                 <w:b/>
-                <w:sz w:val="20"/>
-              </w:rPr>
-              <w:t>技术栈</w:t>
-            </w:r>
-          </w:p>
-        </w:tc>
-        <w:tc>
-          <w:tcPr>
-            <w:tcW w:type="dxa" w:w="2351"/>
-          </w:tcPr>
-          <w:p>
-            <w:pPr>
-              <w:jc w:val="center"/>
-            </w:pPr>
-            <w:r>
-              <w:rPr>
-                <w:b/>
-                <w:sz w:val="20"/>
+                <w:sz w:val="21"/>
               </w:rPr>
               <w:t>负责人</w:t>
             </w:r>
@@ -1264,25 +1515,35 @@
       <w:tr>
         <w:tc>
           <w:tcPr>
-            <w:tcW w:type="dxa" w:w="2351"/>
+            <w:tcW w:type="dxa" w:w="2878"/>
           </w:tcPr>
           <w:p>
+            <w:pPr>
+              <w:jc w:val="center"/>
+            </w:pPr>
+            <w:r/>
             <w:r>
               <w:rPr>
-                <w:sz w:val="20"/>
+                <w:rFonts w:ascii="宋体" w:hAnsi="宋体" w:eastAsia="宋体"/>
+                <w:sz w:val="21"/>
               </w:rPr>
-              <w:t>数据生成模块</w:t>
+              <w:t>数据生成</w:t>
             </w:r>
           </w:p>
         </w:tc>
         <w:tc>
           <w:tcPr>
-            <w:tcW w:type="dxa" w:w="2351"/>
+            <w:tcW w:type="dxa" w:w="2878"/>
           </w:tcPr>
           <w:p>
+            <w:pPr>
+              <w:jc w:val="center"/>
+            </w:pPr>
+            <w:r/>
             <w:r>
               <w:rPr>
-                <w:sz w:val="20"/>
+                <w:rFonts w:ascii="宋体" w:hAnsi="宋体" w:eastAsia="宋体"/>
+                <w:sz w:val="21"/>
               </w:rPr>
               <w:t>物理模型批量计算光谱，生成训练数据</w:t>
             </w:r>
@@ -1290,25 +1551,17 @@
         </w:tc>
         <w:tc>
           <w:tcPr>
-            <w:tcW w:type="dxa" w:w="2351"/>
+            <w:tcW w:type="dxa" w:w="2878"/>
           </w:tcPr>
           <w:p>
+            <w:pPr>
+              <w:jc w:val="center"/>
+            </w:pPr>
+            <w:r/>
             <w:r>
               <w:rPr>
-                <w:sz w:val="20"/>
-              </w:rPr>
-              <w:t>NumPy, torch_model.py</w:t>
-            </w:r>
-          </w:p>
-        </w:tc>
-        <w:tc>
-          <w:tcPr>
-            <w:tcW w:type="dxa" w:w="2351"/>
-          </w:tcPr>
-          <w:p>
-            <w:r>
-              <w:rPr>
-                <w:sz w:val="20"/>
+                <w:rFonts w:ascii="宋体" w:hAnsi="宋体" w:eastAsia="宋体"/>
+                <w:sz w:val="21"/>
               </w:rPr>
               <w:t>侯琢</w:t>
             </w:r>
@@ -1318,25 +1571,35 @@
       <w:tr>
         <w:tc>
           <w:tcPr>
-            <w:tcW w:type="dxa" w:w="2351"/>
+            <w:tcW w:type="dxa" w:w="2878"/>
           </w:tcPr>
           <w:p>
+            <w:pPr>
+              <w:jc w:val="center"/>
+            </w:pPr>
+            <w:r/>
             <w:r>
               <w:rPr>
-                <w:sz w:val="20"/>
+                <w:rFonts w:ascii="宋体" w:hAnsi="宋体" w:eastAsia="宋体"/>
+                <w:sz w:val="21"/>
               </w:rPr>
-              <w:t>模型训练模块</w:t>
+              <w:t>模型训练</w:t>
             </w:r>
           </w:p>
         </w:tc>
         <w:tc>
           <w:tcPr>
-            <w:tcW w:type="dxa" w:w="2351"/>
+            <w:tcW w:type="dxa" w:w="2878"/>
           </w:tcPr>
           <w:p>
+            <w:pPr>
+              <w:jc w:val="center"/>
+            </w:pPr>
+            <w:r/>
             <w:r>
               <w:rPr>
-                <w:sz w:val="20"/>
+                <w:rFonts w:ascii="宋体" w:hAnsi="宋体" w:eastAsia="宋体"/>
+                <w:sz w:val="21"/>
               </w:rPr>
               <w:t>MLP 神经网络训练与超参调优</w:t>
             </w:r>
@@ -1344,25 +1607,17 @@
         </w:tc>
         <w:tc>
           <w:tcPr>
-            <w:tcW w:type="dxa" w:w="2351"/>
+            <w:tcW w:type="dxa" w:w="2878"/>
           </w:tcPr>
           <w:p>
+            <w:pPr>
+              <w:jc w:val="center"/>
+            </w:pPr>
+            <w:r/>
             <w:r>
               <w:rPr>
-                <w:sz w:val="20"/>
-              </w:rPr>
-              <w:t>PyTorch, train_v8_substrate.py</w:t>
-            </w:r>
-          </w:p>
-        </w:tc>
-        <w:tc>
-          <w:tcPr>
-            <w:tcW w:type="dxa" w:w="2351"/>
-          </w:tcPr>
-          <w:p>
-            <w:r>
-              <w:rPr>
-                <w:sz w:val="20"/>
+                <w:rFonts w:ascii="宋体" w:hAnsi="宋体" w:eastAsia="宋体"/>
+                <w:sz w:val="21"/>
               </w:rPr>
               <w:t>侯琢</w:t>
             </w:r>
@@ -1372,25 +1627,35 @@
       <w:tr>
         <w:tc>
           <w:tcPr>
-            <w:tcW w:type="dxa" w:w="2351"/>
+            <w:tcW w:type="dxa" w:w="2878"/>
           </w:tcPr>
           <w:p>
+            <w:pPr>
+              <w:jc w:val="center"/>
+            </w:pPr>
+            <w:r/>
             <w:r>
               <w:rPr>
-                <w:sz w:val="20"/>
+                <w:rFonts w:ascii="宋体" w:hAnsi="宋体" w:eastAsia="宋体"/>
+                <w:sz w:val="21"/>
               </w:rPr>
-              <w:t>模型推理模块</w:t>
+              <w:t>模型推理</w:t>
             </w:r>
           </w:p>
         </w:tc>
         <w:tc>
           <w:tcPr>
-            <w:tcW w:type="dxa" w:w="2351"/>
+            <w:tcW w:type="dxa" w:w="2878"/>
           </w:tcPr>
           <w:p>
+            <w:pPr>
+              <w:jc w:val="center"/>
+            </w:pPr>
+            <w:r/>
             <w:r>
               <w:rPr>
-                <w:sz w:val="20"/>
+                <w:rFonts w:ascii="宋体" w:hAnsi="宋体" w:eastAsia="宋体"/>
+                <w:sz w:val="21"/>
               </w:rPr>
               <w:t>ONNX 模型加载与快速前向推理</w:t>
             </w:r>
@@ -1398,25 +1663,17 @@
         </w:tc>
         <w:tc>
           <w:tcPr>
-            <w:tcW w:type="dxa" w:w="2351"/>
+            <w:tcW w:type="dxa" w:w="2878"/>
           </w:tcPr>
           <w:p>
+            <w:pPr>
+              <w:jc w:val="center"/>
+            </w:pPr>
+            <w:r/>
             <w:r>
               <w:rPr>
-                <w:sz w:val="20"/>
-              </w:rPr>
-              <w:t>ONNX Runtime, ml_module.py</w:t>
-            </w:r>
-          </w:p>
-        </w:tc>
-        <w:tc>
-          <w:tcPr>
-            <w:tcW w:type="dxa" w:w="2351"/>
-          </w:tcPr>
-          <w:p>
-            <w:r>
-              <w:rPr>
-                <w:sz w:val="20"/>
+                <w:rFonts w:ascii="宋体" w:hAnsi="宋体" w:eastAsia="宋体"/>
+                <w:sz w:val="21"/>
               </w:rPr>
               <w:t>侯琢</w:t>
             </w:r>
@@ -1426,51 +1683,53 @@
       <w:tr>
         <w:tc>
           <w:tcPr>
-            <w:tcW w:type="dxa" w:w="2351"/>
+            <w:tcW w:type="dxa" w:w="2878"/>
           </w:tcPr>
           <w:p>
+            <w:pPr>
+              <w:jc w:val="center"/>
+            </w:pPr>
+            <w:r/>
             <w:r>
               <w:rPr>
-                <w:sz w:val="20"/>
+                <w:rFonts w:ascii="宋体" w:hAnsi="宋体" w:eastAsia="宋体"/>
+                <w:sz w:val="21"/>
               </w:rPr>
-              <w:t>物理引擎模块</w:t>
+              <w:t>物理引擎</w:t>
             </w:r>
           </w:p>
         </w:tc>
         <w:tc>
           <w:tcPr>
-            <w:tcW w:type="dxa" w:w="2351"/>
+            <w:tcW w:type="dxa" w:w="2878"/>
           </w:tcPr>
           <w:p>
+            <w:pPr>
+              <w:jc w:val="center"/>
+            </w:pPr>
+            <w:r/>
             <w:r>
               <w:rPr>
-                <w:sz w:val="20"/>
+                <w:rFonts w:ascii="宋体" w:hAnsi="宋体" w:eastAsia="宋体"/>
+                <w:sz w:val="21"/>
               </w:rPr>
-              <w:t>Lorentzian/Fano 共振 &amp; FP 腔光谱</w:t>
+              <w:t>Lorentzian/Fano 共振 &amp; FP 腔光谱建模</w:t>
             </w:r>
           </w:p>
         </w:tc>
         <w:tc>
           <w:tcPr>
-            <w:tcW w:type="dxa" w:w="2351"/>
+            <w:tcW w:type="dxa" w:w="2878"/>
           </w:tcPr>
           <w:p>
+            <w:pPr>
+              <w:jc w:val="center"/>
+            </w:pPr>
+            <w:r/>
             <w:r>
               <w:rPr>
-                <w:sz w:val="20"/>
-              </w:rPr>
-              <w:t>NumPy, torch_model.py</w:t>
-            </w:r>
-          </w:p>
-        </w:tc>
-        <w:tc>
-          <w:tcPr>
-            <w:tcW w:type="dxa" w:w="2351"/>
-          </w:tcPr>
-          <w:p>
-            <w:r>
-              <w:rPr>
-                <w:sz w:val="20"/>
+                <w:rFonts w:ascii="宋体" w:hAnsi="宋体" w:eastAsia="宋体"/>
+                <w:sz w:val="21"/>
               </w:rPr>
               <w:t>谢家珞</w:t>
             </w:r>
@@ -1480,25 +1739,35 @@
       <w:tr>
         <w:tc>
           <w:tcPr>
-            <w:tcW w:type="dxa" w:w="2351"/>
+            <w:tcW w:type="dxa" w:w="2878"/>
           </w:tcPr>
           <w:p>
+            <w:pPr>
+              <w:jc w:val="center"/>
+            </w:pPr>
+            <w:r/>
             <w:r>
               <w:rPr>
-                <w:sz w:val="20"/>
+                <w:rFonts w:ascii="宋体" w:hAnsi="宋体" w:eastAsia="宋体"/>
+                <w:sz w:val="21"/>
               </w:rPr>
-              <w:t>逆设计模块</w:t>
+              <w:t>逆设计</w:t>
             </w:r>
           </w:p>
         </w:tc>
         <w:tc>
           <w:tcPr>
-            <w:tcW w:type="dxa" w:w="2351"/>
+            <w:tcW w:type="dxa" w:w="2878"/>
           </w:tcPr>
           <w:p>
+            <w:pPr>
+              <w:jc w:val="center"/>
+            </w:pPr>
+            <w:r/>
             <w:r>
               <w:rPr>
-                <w:sz w:val="20"/>
+                <w:rFonts w:ascii="宋体" w:hAnsi="宋体" w:eastAsia="宋体"/>
+                <w:sz w:val="21"/>
               </w:rPr>
               <w:t>网格搜索 &amp; 梯度优化逆设计</w:t>
             </w:r>
@@ -1506,25 +1775,17 @@
         </w:tc>
         <w:tc>
           <w:tcPr>
-            <w:tcW w:type="dxa" w:w="2351"/>
+            <w:tcW w:type="dxa" w:w="2878"/>
           </w:tcPr>
           <w:p>
+            <w:pPr>
+              <w:jc w:val="center"/>
+            </w:pPr>
+            <w:r/>
             <w:r>
               <w:rPr>
-                <w:sz w:val="20"/>
-              </w:rPr>
-              <w:t>NumPy, PyTorch, torch_model.py</w:t>
-            </w:r>
-          </w:p>
-        </w:tc>
-        <w:tc>
-          <w:tcPr>
-            <w:tcW w:type="dxa" w:w="2351"/>
-          </w:tcPr>
-          <w:p>
-            <w:r>
-              <w:rPr>
-                <w:sz w:val="20"/>
+                <w:rFonts w:ascii="宋体" w:hAnsi="宋体" w:eastAsia="宋体"/>
+                <w:sz w:val="21"/>
               </w:rPr>
               <w:t>谢家珞</w:t>
             </w:r>
@@ -1534,25 +1795,35 @@
       <w:tr>
         <w:tc>
           <w:tcPr>
-            <w:tcW w:type="dxa" w:w="2351"/>
+            <w:tcW w:type="dxa" w:w="2878"/>
           </w:tcPr>
           <w:p>
+            <w:pPr>
+              <w:jc w:val="center"/>
+            </w:pPr>
+            <w:r/>
             <w:r>
               <w:rPr>
-                <w:sz w:val="20"/>
+                <w:rFonts w:ascii="宋体" w:hAnsi="宋体" w:eastAsia="宋体"/>
+                <w:sz w:val="21"/>
               </w:rPr>
-              <w:t>Web 前端模块</w:t>
+              <w:t>Web 前端</w:t>
             </w:r>
           </w:p>
         </w:tc>
         <w:tc>
           <w:tcPr>
-            <w:tcW w:type="dxa" w:w="2351"/>
+            <w:tcW w:type="dxa" w:w="2878"/>
           </w:tcPr>
           <w:p>
+            <w:pPr>
+              <w:jc w:val="center"/>
+            </w:pPr>
+            <w:r/>
             <w:r>
               <w:rPr>
-                <w:sz w:val="20"/>
+                <w:rFonts w:ascii="宋体" w:hAnsi="宋体" w:eastAsia="宋体"/>
+                <w:sz w:val="21"/>
               </w:rPr>
               <w:t>Streamlit 界面 &amp; 交互逻辑</w:t>
             </w:r>
@@ -1560,25 +1831,17 @@
         </w:tc>
         <w:tc>
           <w:tcPr>
-            <w:tcW w:type="dxa" w:w="2351"/>
+            <w:tcW w:type="dxa" w:w="2878"/>
           </w:tcPr>
           <w:p>
+            <w:pPr>
+              <w:jc w:val="center"/>
+            </w:pPr>
+            <w:r/>
             <w:r>
               <w:rPr>
-                <w:sz w:val="20"/>
-              </w:rPr>
-              <w:t>Streamlit, app.py</w:t>
-            </w:r>
-          </w:p>
-        </w:tc>
-        <w:tc>
-          <w:tcPr>
-            <w:tcW w:type="dxa" w:w="2351"/>
-          </w:tcPr>
-          <w:p>
-            <w:r>
-              <w:rPr>
-                <w:sz w:val="20"/>
+                <w:rFonts w:ascii="宋体" w:hAnsi="宋体" w:eastAsia="宋体"/>
+                <w:sz w:val="21"/>
               </w:rPr>
               <w:t>乔安琪</w:t>
             </w:r>
@@ -1588,12 +1851,17 @@
       <w:tr>
         <w:tc>
           <w:tcPr>
-            <w:tcW w:type="dxa" w:w="2351"/>
+            <w:tcW w:type="dxa" w:w="2878"/>
           </w:tcPr>
           <w:p>
+            <w:pPr>
+              <w:jc w:val="center"/>
+            </w:pPr>
+            <w:r/>
             <w:r>
               <w:rPr>
-                <w:sz w:val="20"/>
+                <w:rFonts w:ascii="宋体" w:hAnsi="宋体" w:eastAsia="宋体"/>
+                <w:sz w:val="21"/>
               </w:rPr>
               <w:t>LLM 模块</w:t>
             </w:r>
@@ -1601,12 +1869,17 @@
         </w:tc>
         <w:tc>
           <w:tcPr>
-            <w:tcW w:type="dxa" w:w="2351"/>
+            <w:tcW w:type="dxa" w:w="2878"/>
           </w:tcPr>
           <w:p>
+            <w:pPr>
+              <w:jc w:val="center"/>
+            </w:pPr>
+            <w:r/>
             <w:r>
               <w:rPr>
-                <w:sz w:val="20"/>
+                <w:rFonts w:ascii="宋体" w:hAnsi="宋体" w:eastAsia="宋体"/>
+                <w:sz w:val="21"/>
               </w:rPr>
               <w:t>DeepSeek API 集成 &amp; 提示词工程</w:t>
             </w:r>
@@ -1614,86 +1887,30 @@
         </w:tc>
         <w:tc>
           <w:tcPr>
-            <w:tcW w:type="dxa" w:w="2351"/>
+            <w:tcW w:type="dxa" w:w="2878"/>
           </w:tcPr>
           <w:p>
+            <w:pPr>
+              <w:jc w:val="center"/>
+            </w:pPr>
+            <w:r/>
             <w:r>
               <w:rPr>
-                <w:sz w:val="20"/>
-              </w:rPr>
-              <w:t>Python, llm/</w:t>
-            </w:r>
-          </w:p>
-        </w:tc>
-        <w:tc>
-          <w:tcPr>
-            <w:tcW w:type="dxa" w:w="2351"/>
-          </w:tcPr>
-          <w:p>
-            <w:r>
-              <w:rPr>
-                <w:sz w:val="20"/>
+                <w:rFonts w:ascii="宋体" w:hAnsi="宋体" w:eastAsia="宋体"/>
+                <w:sz w:val="21"/>
               </w:rPr>
               <w:t>乔安琪</w:t>
             </w:r>
           </w:p>
         </w:tc>
       </w:tr>
-      <w:tr>
-        <w:tc>
-          <w:tcPr>
-            <w:tcW w:type="dxa" w:w="2351"/>
-          </w:tcPr>
-          <w:p>
-            <w:r>
-              <w:rPr>
-                <w:sz w:val="20"/>
-              </w:rPr>
-              <w:t>角谱传播模块</w:t>
-            </w:r>
-          </w:p>
-        </w:tc>
-        <w:tc>
-          <w:tcPr>
-            <w:tcW w:type="dxa" w:w="2351"/>
-          </w:tcPr>
-          <w:p>
-            <w:r>
-              <w:rPr>
-                <w:sz w:val="20"/>
-              </w:rPr>
-              <w:t>NA/观察角远场光谱计算</w:t>
-            </w:r>
-          </w:p>
-        </w:tc>
-        <w:tc>
-          <w:tcPr>
-            <w:tcW w:type="dxa" w:w="2351"/>
-          </w:tcPr>
-          <w:p>
-            <w:r>
-              <w:rPr>
-                <w:sz w:val="20"/>
-              </w:rPr>
-              <w:t>NumPy</w:t>
-            </w:r>
-          </w:p>
-        </w:tc>
-        <w:tc>
-          <w:tcPr>
-            <w:tcW w:type="dxa" w:w="2351"/>
-          </w:tcPr>
-          <w:p>
-            <w:r>
-              <w:rPr>
-                <w:sz w:val="20"/>
-              </w:rPr>
-              <w:t>谢家珞</w:t>
-            </w:r>
-          </w:p>
-        </w:tc>
-      </w:tr>
     </w:tbl>
+    <w:p/>
+    <w:p>
+      <w:r>
+        <w:br w:type="page"/>
+      </w:r>
+    </w:p>
     <w:p>
       <w:pPr>
         <w:pStyle w:val="Heading1"/>
@@ -1718,7 +1935,8 @@
     </w:p>
     <w:p>
       <w:pPr>
-        <w:ind w:firstLine="425"/>
+        <w:spacing w:line="360" w:lineRule="auto"/>
+        <w:ind w:firstLine="420"/>
       </w:pPr>
       <w:r>
         <w:rPr>
@@ -1737,25 +1955,27 @@
         <w:tblLook w:firstColumn="1" w:firstRow="1" w:lastColumn="0" w:lastRow="0" w:noHBand="0" w:noVBand="1" w:val="04A0"/>
       </w:tblPr>
       <w:tblGrid>
-        <w:gridCol w:w="1881"/>
-        <w:gridCol w:w="1881"/>
-        <w:gridCol w:w="1881"/>
-        <w:gridCol w:w="1881"/>
-        <w:gridCol w:w="1881"/>
+        <w:gridCol w:w="2158"/>
+        <w:gridCol w:w="2158"/>
+        <w:gridCol w:w="2158"/>
+        <w:gridCol w:w="2158"/>
       </w:tblGrid>
       <w:tr>
         <w:tc>
           <w:tcPr>
-            <w:tcW w:type="dxa" w:w="1881"/>
+            <w:tcW w:type="dxa" w:w="2158"/>
+            <w:shd w:fill="D9E2F3"/>
           </w:tcPr>
           <w:p>
             <w:pPr>
               <w:jc w:val="center"/>
             </w:pPr>
+            <w:r/>
             <w:r>
               <w:rPr>
+                <w:rFonts w:ascii="宋体" w:hAnsi="宋体" w:eastAsia="宋体"/>
                 <w:b/>
-                <w:sz w:val="20"/>
+                <w:sz w:val="21"/>
               </w:rPr>
               <w:t>数据集</w:t>
             </w:r>
@@ -1763,16 +1983,19 @@
         </w:tc>
         <w:tc>
           <w:tcPr>
-            <w:tcW w:type="dxa" w:w="1881"/>
+            <w:tcW w:type="dxa" w:w="2158"/>
+            <w:shd w:fill="D9E2F3"/>
           </w:tcPr>
           <w:p>
             <w:pPr>
               <w:jc w:val="center"/>
             </w:pPr>
+            <w:r/>
             <w:r>
               <w:rPr>
+                <w:rFonts w:ascii="宋体" w:hAnsi="宋体" w:eastAsia="宋体"/>
                 <w:b/>
-                <w:sz w:val="20"/>
+                <w:sz w:val="21"/>
               </w:rPr>
               <w:t>样本量</w:t>
             </w:r>
@@ -1780,16 +2003,19 @@
         </w:tc>
         <w:tc>
           <w:tcPr>
-            <w:tcW w:type="dxa" w:w="1881"/>
+            <w:tcW w:type="dxa" w:w="2158"/>
+            <w:shd w:fill="D9E2F3"/>
           </w:tcPr>
           <w:p>
             <w:pPr>
               <w:jc w:val="center"/>
             </w:pPr>
+            <w:r/>
             <w:r>
               <w:rPr>
+                <w:rFonts w:ascii="宋体" w:hAnsi="宋体" w:eastAsia="宋体"/>
                 <w:b/>
-                <w:sz w:val="20"/>
+                <w:sz w:val="21"/>
               </w:rPr>
               <w:t>输入维度</w:t>
             </w:r>
@@ -1797,33 +2023,19 @@
         </w:tc>
         <w:tc>
           <w:tcPr>
-            <w:tcW w:type="dxa" w:w="1881"/>
+            <w:tcW w:type="dxa" w:w="2158"/>
+            <w:shd w:fill="D9E2F3"/>
           </w:tcPr>
           <w:p>
             <w:pPr>
               <w:jc w:val="center"/>
             </w:pPr>
+            <w:r/>
             <w:r>
               <w:rPr>
+                <w:rFonts w:ascii="宋体" w:hAnsi="宋体" w:eastAsia="宋体"/>
                 <w:b/>
-                <w:sz w:val="20"/>
-              </w:rPr>
-              <w:t>输出维度</w:t>
-            </w:r>
-          </w:p>
-        </w:tc>
-        <w:tc>
-          <w:tcPr>
-            <w:tcW w:type="dxa" w:w="1881"/>
-          </w:tcPr>
-          <w:p>
-            <w:pPr>
-              <w:jc w:val="center"/>
-            </w:pPr>
-            <w:r>
-              <w:rPr>
-                <w:b/>
-                <w:sz w:val="20"/>
+                <w:sz w:val="21"/>
               </w:rPr>
               <w:t>用途</w:t>
             </w:r>
@@ -1833,12 +2045,17 @@
       <w:tr>
         <w:tc>
           <w:tcPr>
-            <w:tcW w:type="dxa" w:w="1881"/>
+            <w:tcW w:type="dxa" w:w="2158"/>
           </w:tcPr>
           <w:p>
+            <w:pPr>
+              <w:jc w:val="center"/>
+            </w:pPr>
+            <w:r/>
             <w:r>
               <w:rPr>
-                <w:sz w:val="20"/>
+                <w:rFonts w:ascii="宋体" w:hAnsi="宋体" w:eastAsia="宋体"/>
+                <w:sz w:val="21"/>
               </w:rPr>
               <w:t>30k_v3.pkl</w:t>
             </w:r>
@@ -1846,12 +2063,17 @@
         </w:tc>
         <w:tc>
           <w:tcPr>
-            <w:tcW w:type="dxa" w:w="1881"/>
+            <w:tcW w:type="dxa" w:w="2158"/>
           </w:tcPr>
           <w:p>
+            <w:pPr>
+              <w:jc w:val="center"/>
+            </w:pPr>
+            <w:r/>
             <w:r>
               <w:rPr>
-                <w:sz w:val="20"/>
+                <w:rFonts w:ascii="宋体" w:hAnsi="宋体" w:eastAsia="宋体"/>
+                <w:sz w:val="21"/>
               </w:rPr>
               <w:t>30,000</w:t>
             </w:r>
@@ -1859,12 +2081,17 @@
         </w:tc>
         <w:tc>
           <w:tcPr>
-            <w:tcW w:type="dxa" w:w="1881"/>
+            <w:tcW w:type="dxa" w:w="2158"/>
           </w:tcPr>
           <w:p>
+            <w:pPr>
+              <w:jc w:val="center"/>
+            </w:pPr>
+            <w:r/>
             <w:r>
               <w:rPr>
-                <w:sz w:val="20"/>
+                <w:rFonts w:ascii="宋体" w:hAnsi="宋体" w:eastAsia="宋体"/>
+                <w:sz w:val="21"/>
               </w:rPr>
               <w:t>D,H,P</w:t>
             </w:r>
@@ -1872,25 +2099,17 @@
         </w:tc>
         <w:tc>
           <w:tcPr>
-            <w:tcW w:type="dxa" w:w="1881"/>
+            <w:tcW w:type="dxa" w:w="2158"/>
           </w:tcPr>
           <w:p>
+            <w:pPr>
+              <w:jc w:val="center"/>
+            </w:pPr>
+            <w:r/>
             <w:r>
               <w:rPr>
-                <w:sz w:val="20"/>
-              </w:rPr>
-              <w:t>3 (XYZ)</w:t>
-            </w:r>
-          </w:p>
-        </w:tc>
-        <w:tc>
-          <w:tcPr>
-            <w:tcW w:type="dxa" w:w="1881"/>
-          </w:tcPr>
-          <w:p>
-            <w:r>
-              <w:rPr>
-                <w:sz w:val="20"/>
+                <w:rFonts w:ascii="宋体" w:hAnsi="宋体" w:eastAsia="宋体"/>
+                <w:sz w:val="21"/>
               </w:rPr>
               <w:t>早期单柱 MLP</w:t>
             </w:r>
@@ -1900,12 +2119,17 @@
       <w:tr>
         <w:tc>
           <w:tcPr>
-            <w:tcW w:type="dxa" w:w="1881"/>
+            <w:tcW w:type="dxa" w:w="2158"/>
           </w:tcPr>
           <w:p>
+            <w:pPr>
+              <w:jc w:val="center"/>
+            </w:pPr>
+            <w:r/>
             <w:r>
               <w:rPr>
-                <w:sz w:val="20"/>
+                <w:rFonts w:ascii="宋体" w:hAnsi="宋体" w:eastAsia="宋体"/>
+                <w:sz w:val="21"/>
               </w:rPr>
               <w:t>200k_v6_fano.pkl</w:t>
             </w:r>
@@ -1913,12 +2137,17 @@
         </w:tc>
         <w:tc>
           <w:tcPr>
-            <w:tcW w:type="dxa" w:w="1881"/>
+            <w:tcW w:type="dxa" w:w="2158"/>
           </w:tcPr>
           <w:p>
+            <w:pPr>
+              <w:jc w:val="center"/>
+            </w:pPr>
+            <w:r/>
             <w:r>
               <w:rPr>
-                <w:sz w:val="20"/>
+                <w:rFonts w:ascii="宋体" w:hAnsi="宋体" w:eastAsia="宋体"/>
+                <w:sz w:val="21"/>
               </w:rPr>
               <w:t>200,000</w:t>
             </w:r>
@@ -1926,12 +2155,17 @@
         </w:tc>
         <w:tc>
           <w:tcPr>
-            <w:tcW w:type="dxa" w:w="1881"/>
+            <w:tcW w:type="dxa" w:w="2158"/>
           </w:tcPr>
           <w:p>
+            <w:pPr>
+              <w:jc w:val="center"/>
+            </w:pPr>
+            <w:r/>
             <w:r>
               <w:rPr>
-                <w:sz w:val="20"/>
+                <w:rFonts w:ascii="宋体" w:hAnsi="宋体" w:eastAsia="宋体"/>
+                <w:sz w:val="21"/>
               </w:rPr>
               <w:t>D,H,P,θ,pol</w:t>
             </w:r>
@@ -1939,25 +2173,17 @@
         </w:tc>
         <w:tc>
           <w:tcPr>
-            <w:tcW w:type="dxa" w:w="1881"/>
+            <w:tcW w:type="dxa" w:w="2158"/>
           </w:tcPr>
           <w:p>
+            <w:pPr>
+              <w:jc w:val="center"/>
+            </w:pPr>
+            <w:r/>
             <w:r>
               <w:rPr>
-                <w:sz w:val="20"/>
-              </w:rPr>
-              <w:t>3 (XYZ)</w:t>
-            </w:r>
-          </w:p>
-        </w:tc>
-        <w:tc>
-          <w:tcPr>
-            <w:tcW w:type="dxa" w:w="1881"/>
-          </w:tcPr>
-          <w:p>
-            <w:r>
-              <w:rPr>
-                <w:sz w:val="20"/>
+                <w:rFonts w:ascii="宋体" w:hAnsi="宋体" w:eastAsia="宋体"/>
+                <w:sz w:val="21"/>
               </w:rPr>
               <w:t>Fano共振增强版</w:t>
             </w:r>
@@ -1967,12 +2193,17 @@
       <w:tr>
         <w:tc>
           <w:tcPr>
-            <w:tcW w:type="dxa" w:w="1881"/>
+            <w:tcW w:type="dxa" w:w="2158"/>
           </w:tcPr>
           <w:p>
+            <w:pPr>
+              <w:jc w:val="center"/>
+            </w:pPr>
+            <w:r/>
             <w:r>
               <w:rPr>
-                <w:sz w:val="20"/>
+                <w:rFonts w:ascii="宋体" w:hAnsi="宋体" w:eastAsia="宋体"/>
+                <w:sz w:val="21"/>
               </w:rPr>
               <w:t>200k_v7_multi.pkl</w:t>
             </w:r>
@@ -1980,12 +2211,17 @@
         </w:tc>
         <w:tc>
           <w:tcPr>
-            <w:tcW w:type="dxa" w:w="1881"/>
+            <w:tcW w:type="dxa" w:w="2158"/>
           </w:tcPr>
           <w:p>
+            <w:pPr>
+              <w:jc w:val="center"/>
+            </w:pPr>
+            <w:r/>
             <w:r>
               <w:rPr>
-                <w:sz w:val="20"/>
+                <w:rFonts w:ascii="宋体" w:hAnsi="宋体" w:eastAsia="宋体"/>
+                <w:sz w:val="21"/>
               </w:rPr>
               <w:t>200,000</w:t>
             </w:r>
@@ -1993,12 +2229,17 @@
         </w:tc>
         <w:tc>
           <w:tcPr>
-            <w:tcW w:type="dxa" w:w="1881"/>
+            <w:tcW w:type="dxa" w:w="2158"/>
           </w:tcPr>
           <w:p>
+            <w:pPr>
+              <w:jc w:val="center"/>
+            </w:pPr>
+            <w:r/>
             <w:r>
               <w:rPr>
-                <w:sz w:val="20"/>
+                <w:rFonts w:ascii="宋体" w:hAnsi="宋体" w:eastAsia="宋体"/>
+                <w:sz w:val="21"/>
               </w:rPr>
               <w:t>D,H,P,θ,pol,mat</w:t>
             </w:r>
@@ -2006,25 +2247,17 @@
         </w:tc>
         <w:tc>
           <w:tcPr>
-            <w:tcW w:type="dxa" w:w="1881"/>
+            <w:tcW w:type="dxa" w:w="2158"/>
           </w:tcPr>
           <w:p>
+            <w:pPr>
+              <w:jc w:val="center"/>
+            </w:pPr>
+            <w:r/>
             <w:r>
               <w:rPr>
-                <w:sz w:val="20"/>
-              </w:rPr>
-              <w:t>3 (XYZ)</w:t>
-            </w:r>
-          </w:p>
-        </w:tc>
-        <w:tc>
-          <w:tcPr>
-            <w:tcW w:type="dxa" w:w="1881"/>
-          </w:tcPr>
-          <w:p>
-            <w:r>
-              <w:rPr>
-                <w:sz w:val="20"/>
+                <w:rFonts w:ascii="宋体" w:hAnsi="宋体" w:eastAsia="宋体"/>
+                <w:sz w:val="21"/>
               </w:rPr>
               <w:t>多材料版</w:t>
             </w:r>
@@ -2034,12 +2267,17 @@
       <w:tr>
         <w:tc>
           <w:tcPr>
-            <w:tcW w:type="dxa" w:w="1881"/>
+            <w:tcW w:type="dxa" w:w="2158"/>
           </w:tcPr>
           <w:p>
+            <w:pPr>
+              <w:jc w:val="center"/>
+            </w:pPr>
+            <w:r/>
             <w:r>
               <w:rPr>
-                <w:sz w:val="20"/>
+                <w:rFonts w:ascii="宋体" w:hAnsi="宋体" w:eastAsia="宋体"/>
+                <w:sz w:val="21"/>
               </w:rPr>
               <w:t>dual_200k_v3_multi.pkl</w:t>
             </w:r>
@@ -2047,12 +2285,17 @@
         </w:tc>
         <w:tc>
           <w:tcPr>
-            <w:tcW w:type="dxa" w:w="1881"/>
+            <w:tcW w:type="dxa" w:w="2158"/>
           </w:tcPr>
           <w:p>
+            <w:pPr>
+              <w:jc w:val="center"/>
+            </w:pPr>
+            <w:r/>
             <w:r>
               <w:rPr>
-                <w:sz w:val="20"/>
+                <w:rFonts w:ascii="宋体" w:hAnsi="宋体" w:eastAsia="宋体"/>
+                <w:sz w:val="21"/>
               </w:rPr>
               <w:t>200,000</w:t>
             </w:r>
@@ -2060,12 +2303,17 @@
         </w:tc>
         <w:tc>
           <w:tcPr>
-            <w:tcW w:type="dxa" w:w="1881"/>
+            <w:tcW w:type="dxa" w:w="2158"/>
           </w:tcPr>
           <w:p>
+            <w:pPr>
+              <w:jc w:val="center"/>
+            </w:pPr>
+            <w:r/>
             <w:r>
               <w:rPr>
-                <w:sz w:val="20"/>
+                <w:rFonts w:ascii="宋体" w:hAnsi="宋体" w:eastAsia="宋体"/>
+                <w:sz w:val="21"/>
               </w:rPr>
               <w:t>D1,H1,D2,H2,P,θ,pol,mat,sub</w:t>
             </w:r>
@@ -2073,25 +2321,17 @@
         </w:tc>
         <w:tc>
           <w:tcPr>
-            <w:tcW w:type="dxa" w:w="1881"/>
+            <w:tcW w:type="dxa" w:w="2158"/>
           </w:tcPr>
           <w:p>
+            <w:pPr>
+              <w:jc w:val="center"/>
+            </w:pPr>
+            <w:r/>
             <w:r>
               <w:rPr>
-                <w:sz w:val="20"/>
-              </w:rPr>
-              <w:t>3 (XYZ)</w:t>
-            </w:r>
-          </w:p>
-        </w:tc>
-        <w:tc>
-          <w:tcPr>
-            <w:tcW w:type="dxa" w:w="1881"/>
-          </w:tcPr>
-          <w:p>
-            <w:r>
-              <w:rPr>
-                <w:sz w:val="20"/>
+                <w:rFonts w:ascii="宋体" w:hAnsi="宋体" w:eastAsia="宋体"/>
+                <w:sz w:val="21"/>
               </w:rPr>
               <w:t>双柱多材料衬底版</w:t>
             </w:r>
@@ -2113,7 +2353,8 @@
     </w:p>
     <w:p>
       <w:pPr>
-        <w:ind w:firstLine="425"/>
+        <w:spacing w:line="360" w:lineRule="auto"/>
+        <w:ind w:firstLine="420"/>
       </w:pPr>
       <w:r>
         <w:rPr>
@@ -2126,7 +2367,7 @@
     </w:p>
     <w:p>
       <w:pPr>
-        <w:ind w:firstLine="425"/>
+        <w:spacing w:line="360" w:lineRule="auto"/>
       </w:pPr>
       <w:r>
         <w:rPr>
@@ -2153,20 +2394,8 @@
     </w:p>
     <w:p>
       <w:pPr>
-        <w:ind w:firstLine="425"/>
-      </w:pPr>
-      <w:r>
-        <w:rPr>
-          <w:rFonts w:ascii="宋体" w:hAnsi="宋体" w:eastAsia="宋体"/>
-          <w:b w:val="0"/>
-          <w:sz w:val="24"/>
-        </w:rPr>
-        <w:t>核心代码参考 train_v8_substrate.py（训练脚本）和 ml_module.py（推理模块）。训练完成后导出为 ONNX 格式，推理速度从 PyTorch 的 ~2ms/次优化到 ONNX Runtime 的 ~0.5ms/次。</w:t>
-      </w:r>
-    </w:p>
-    <w:p>
-      <w:pPr>
-        <w:ind w:firstLine="425"/>
+        <w:spacing w:line="360" w:lineRule="auto"/>
+        <w:ind w:firstLine="420"/>
       </w:pPr>
       <w:r>
         <w:rPr>
@@ -2190,7 +2419,8 @@
     </w:p>
     <w:p>
       <w:pPr>
-        <w:ind w:firstLine="425"/>
+        <w:spacing w:line="360" w:lineRule="auto"/>
+        <w:ind w:firstLine="420"/>
       </w:pPr>
       <w:r>
         <w:rPr>
@@ -2203,7 +2433,7 @@
     </w:p>
     <w:p>
       <w:pPr>
-        <w:ind w:firstLine="425"/>
+        <w:spacing w:line="360" w:lineRule="auto"/>
       </w:pPr>
       <w:r>
         <w:rPr>
@@ -2211,12 +2441,12 @@
           <w:b w:val="0"/>
           <w:sz w:val="24"/>
         </w:rPr>
-        <w:t>（1）AI 色彩分析（analyze_color）：将当前纳米柱参数和颜色结果发送给大模型，模型从纳米光子学角度分析颜色产生的物理原因（米氏共振、结构干涉等），并用通俗语言解释。</w:t>
+        <w:t>（1）AI 色彩分析：将当前纳米柱参数和颜色结果发送给大模型，模型从纳米光子学角度分析颜色产生的物理原因（米氏共振、结构干涉等），并用通俗语言解释。</w:t>
       </w:r>
     </w:p>
     <w:p>
       <w:pPr>
-        <w:ind w:firstLine="425"/>
+        <w:spacing w:line="360" w:lineRule="auto"/>
       </w:pPr>
       <w:r>
         <w:rPr>
@@ -2224,12 +2454,12 @@
           <w:b w:val="0"/>
           <w:sz w:val="24"/>
         </w:rPr>
-        <w:t>（2）参数优化建议（suggest_params）：在逆设计场景中，大模型根据目标颜色和当前参数，结合超表面设计领域知识，给出调整方向（增大/减小 D、H、P）和幅度建议。</w:t>
+        <w:t>（2）参数优化建议：在逆设计场景中，大模型根据目标颜色和当前参数，结合超表面设计领域知识，给出调整方向和幅度建议。</w:t>
       </w:r>
     </w:p>
     <w:p>
       <w:pPr>
-        <w:ind w:firstLine="425"/>
+        <w:spacing w:line="360" w:lineRule="auto"/>
       </w:pPr>
       <w:r>
         <w:rPr>
@@ -2237,20 +2467,7 @@
           <w:b w:val="0"/>
           <w:sz w:val="24"/>
         </w:rPr>
-        <w:t>提示词工程：系统提示词设定大模型角色为"超表面光学专家"，要求回答简洁、分点列出、使用中文。API 调用采用标准 OpenAI 兼容接口，最大 token 设为 512，超时时间 30 秒。</w:t>
-      </w:r>
-    </w:p>
-    <w:p>
-      <w:pPr>
-        <w:ind w:firstLine="425"/>
-      </w:pPr>
-      <w:r>
-        <w:rPr>
-          <w:rFonts w:ascii="宋体" w:hAnsi="宋体" w:eastAsia="宋体"/>
-          <w:b w:val="0"/>
-          <w:sz w:val="24"/>
-        </w:rPr>
-        <w:t>错误处理：若 API Key 未设置或网络异常，自动降级显示中文错误提示，不阻塞主程序运行。</w:t>
+        <w:t>提示词工程：系统提示词设定大模型角色为“超表面光学专家”，要求回答简洁、分点列出、使用中文。云端部署已预配置 API 密钥，评审老师可直接访问体验。</w:t>
       </w:r>
     </w:p>
     <w:p>
@@ -2266,7 +2483,8 @@
     </w:p>
     <w:p>
       <w:pPr>
-        <w:ind w:firstLine="425"/>
+        <w:spacing w:line="360" w:lineRule="auto"/>
+        <w:ind w:firstLine="420"/>
       </w:pPr>
       <w:r>
         <w:rPr>
@@ -2274,12 +2492,12 @@
           <w:b w:val="0"/>
           <w:sz w:val="24"/>
         </w:rPr>
-        <w:t>系统基于 Streamlit 框架构建 Web 交互界面，支持以下功能：</w:t>
+        <w:t>系统基于 Streamlit 框架构建 WEB 交互界面，支持以下功能：</w:t>
       </w:r>
     </w:p>
     <w:p>
       <w:pPr>
-        <w:ind w:firstLine="425"/>
+        <w:spacing w:line="360" w:lineRule="auto"/>
       </w:pPr>
       <w:r>
         <w:rPr>
@@ -2302,6 +2520,11 @@
         <w:t>（7）逆设计面板：网格搜索 / 双柱自动搜索 / FP腔搜索</w:t>
         <w:br/>
         <w:t>（8）图案生成：上传图片 → 像素级纳米柱匹配 → 阵列可视化</w:t>
+      </w:r>
+    </w:p>
+    <w:p>
+      <w:r>
+        <w:br w:type="page"/>
       </w:r>
     </w:p>
     <w:p>
@@ -2334,24 +2557,27 @@
         <w:tblLook w:firstColumn="1" w:firstRow="1" w:lastColumn="0" w:lastRow="0" w:noHBand="0" w:noVBand="1" w:val="04A0"/>
       </w:tblPr>
       <w:tblGrid>
-        <w:gridCol w:w="2351"/>
-        <w:gridCol w:w="2351"/>
-        <w:gridCol w:w="2351"/>
-        <w:gridCol w:w="2351"/>
+        <w:gridCol w:w="2158"/>
+        <w:gridCol w:w="2158"/>
+        <w:gridCol w:w="2158"/>
+        <w:gridCol w:w="2158"/>
       </w:tblGrid>
       <w:tr>
         <w:tc>
           <w:tcPr>
-            <w:tcW w:type="dxa" w:w="2351"/>
+            <w:tcW w:type="dxa" w:w="2158"/>
+            <w:shd w:fill="D9E2F3"/>
           </w:tcPr>
           <w:p>
             <w:pPr>
               <w:jc w:val="center"/>
             </w:pPr>
+            <w:r/>
             <w:r>
               <w:rPr>
+                <w:rFonts w:ascii="宋体" w:hAnsi="宋体" w:eastAsia="宋体"/>
                 <w:b/>
-                <w:sz w:val="20"/>
+                <w:sz w:val="21"/>
               </w:rPr>
               <w:t>测试用例</w:t>
             </w:r>
@@ -2359,16 +2585,19 @@
         </w:tc>
         <w:tc>
           <w:tcPr>
-            <w:tcW w:type="dxa" w:w="2351"/>
+            <w:tcW w:type="dxa" w:w="2158"/>
+            <w:shd w:fill="D9E2F3"/>
           </w:tcPr>
           <w:p>
             <w:pPr>
               <w:jc w:val="center"/>
             </w:pPr>
+            <w:r/>
             <w:r>
               <w:rPr>
+                <w:rFonts w:ascii="宋体" w:hAnsi="宋体" w:eastAsia="宋体"/>
                 <w:b/>
-                <w:sz w:val="20"/>
+                <w:sz w:val="21"/>
               </w:rPr>
               <w:t>预期效果</w:t>
             </w:r>
@@ -2376,16 +2605,19 @@
         </w:tc>
         <w:tc>
           <w:tcPr>
-            <w:tcW w:type="dxa" w:w="2351"/>
+            <w:tcW w:type="dxa" w:w="2158"/>
+            <w:shd w:fill="D9E2F3"/>
           </w:tcPr>
           <w:p>
             <w:pPr>
               <w:jc w:val="center"/>
             </w:pPr>
+            <w:r/>
             <w:r>
               <w:rPr>
+                <w:rFonts w:ascii="宋体" w:hAnsi="宋体" w:eastAsia="宋体"/>
                 <w:b/>
-                <w:sz w:val="20"/>
+                <w:sz w:val="21"/>
               </w:rPr>
               <w:t>实际结果</w:t>
             </w:r>
@@ -2393,16 +2625,19 @@
         </w:tc>
         <w:tc>
           <w:tcPr>
-            <w:tcW w:type="dxa" w:w="2351"/>
+            <w:tcW w:type="dxa" w:w="2158"/>
+            <w:shd w:fill="D9E2F3"/>
           </w:tcPr>
           <w:p>
             <w:pPr>
               <w:jc w:val="center"/>
             </w:pPr>
+            <w:r/>
             <w:r>
               <w:rPr>
+                <w:rFonts w:ascii="宋体" w:hAnsi="宋体" w:eastAsia="宋体"/>
                 <w:b/>
-                <w:sz w:val="20"/>
+                <w:sz w:val="21"/>
               </w:rPr>
               <w:t>状态</w:t>
             </w:r>
@@ -2412,12 +2647,17 @@
       <w:tr>
         <w:tc>
           <w:tcPr>
-            <w:tcW w:type="dxa" w:w="2351"/>
+            <w:tcW w:type="dxa" w:w="2158"/>
           </w:tcPr>
           <w:p>
+            <w:pPr>
+              <w:jc w:val="center"/>
+            </w:pPr>
+            <w:r/>
             <w:r>
               <w:rPr>
-                <w:sz w:val="20"/>
+                <w:rFonts w:ascii="宋体" w:hAnsi="宋体" w:eastAsia="宋体"/>
+                <w:sz w:val="21"/>
               </w:rPr>
               <w:t>单柱参数调节</w:t>
             </w:r>
@@ -2425,12 +2665,17 @@
         </w:tc>
         <w:tc>
           <w:tcPr>
-            <w:tcW w:type="dxa" w:w="2351"/>
+            <w:tcW w:type="dxa" w:w="2158"/>
           </w:tcPr>
           <w:p>
+            <w:pPr>
+              <w:jc w:val="center"/>
+            </w:pPr>
+            <w:r/>
             <w:r>
               <w:rPr>
-                <w:sz w:val="20"/>
+                <w:rFonts w:ascii="宋体" w:hAnsi="宋体" w:eastAsia="宋体"/>
+                <w:sz w:val="21"/>
               </w:rPr>
               <w:t>颜色实时更新</w:t>
             </w:r>
@@ -2438,12 +2683,17 @@
         </w:tc>
         <w:tc>
           <w:tcPr>
-            <w:tcW w:type="dxa" w:w="2351"/>
+            <w:tcW w:type="dxa" w:w="2158"/>
           </w:tcPr>
           <w:p>
+            <w:pPr>
+              <w:jc w:val="center"/>
+            </w:pPr>
+            <w:r/>
             <w:r>
               <w:rPr>
-                <w:sz w:val="20"/>
+                <w:rFonts w:ascii="宋体" w:hAnsi="宋体" w:eastAsia="宋体"/>
+                <w:sz w:val="21"/>
               </w:rPr>
               <w:t>拖动滑块 &lt; 50ms 内刷新</w:t>
             </w:r>
@@ -2451,12 +2701,17 @@
         </w:tc>
         <w:tc>
           <w:tcPr>
-            <w:tcW w:type="dxa" w:w="2351"/>
+            <w:tcW w:type="dxa" w:w="2158"/>
           </w:tcPr>
           <w:p>
+            <w:pPr>
+              <w:jc w:val="center"/>
+            </w:pPr>
+            <w:r/>
             <w:r>
               <w:rPr>
-                <w:sz w:val="20"/>
+                <w:rFonts w:ascii="宋体" w:hAnsi="宋体" w:eastAsia="宋体"/>
+                <w:sz w:val="21"/>
               </w:rPr>
               <w:t>✓</w:t>
             </w:r>
@@ -2466,12 +2721,17 @@
       <w:tr>
         <w:tc>
           <w:tcPr>
-            <w:tcW w:type="dxa" w:w="2351"/>
+            <w:tcW w:type="dxa" w:w="2158"/>
           </w:tcPr>
           <w:p>
+            <w:pPr>
+              <w:jc w:val="center"/>
+            </w:pPr>
+            <w:r/>
             <w:r>
               <w:rPr>
-                <w:sz w:val="20"/>
+                <w:rFonts w:ascii="宋体" w:hAnsi="宋体" w:eastAsia="宋体"/>
+                <w:sz w:val="21"/>
               </w:rPr>
               <w:t>双柱参数调节</w:t>
             </w:r>
@@ -2479,12 +2739,17 @@
         </w:tc>
         <w:tc>
           <w:tcPr>
-            <w:tcW w:type="dxa" w:w="2351"/>
+            <w:tcW w:type="dxa" w:w="2158"/>
           </w:tcPr>
           <w:p>
+            <w:pPr>
+              <w:jc w:val="center"/>
+            </w:pPr>
+            <w:r/>
             <w:r>
               <w:rPr>
-                <w:sz w:val="20"/>
+                <w:rFonts w:ascii="宋体" w:hAnsi="宋体" w:eastAsia="宋体"/>
+                <w:sz w:val="21"/>
               </w:rPr>
               <w:t>ED+MD共振叠加颜色</w:t>
             </w:r>
@@ -2492,12 +2757,17 @@
         </w:tc>
         <w:tc>
           <w:tcPr>
-            <w:tcW w:type="dxa" w:w="2351"/>
+            <w:tcW w:type="dxa" w:w="2158"/>
           </w:tcPr>
           <w:p>
+            <w:pPr>
+              <w:jc w:val="center"/>
+            </w:pPr>
+            <w:r/>
             <w:r>
               <w:rPr>
-                <w:sz w:val="20"/>
+                <w:rFonts w:ascii="宋体" w:hAnsi="宋体" w:eastAsia="宋体"/>
+                <w:sz w:val="21"/>
               </w:rPr>
               <w:t>双峰光谱正确叠加</w:t>
             </w:r>
@@ -2505,12 +2775,17 @@
         </w:tc>
         <w:tc>
           <w:tcPr>
-            <w:tcW w:type="dxa" w:w="2351"/>
+            <w:tcW w:type="dxa" w:w="2158"/>
           </w:tcPr>
           <w:p>
+            <w:pPr>
+              <w:jc w:val="center"/>
+            </w:pPr>
+            <w:r/>
             <w:r>
               <w:rPr>
-                <w:sz w:val="20"/>
+                <w:rFonts w:ascii="宋体" w:hAnsi="宋体" w:eastAsia="宋体"/>
+                <w:sz w:val="21"/>
               </w:rPr>
               <w:t>✓</w:t>
             </w:r>
@@ -2520,12 +2795,17 @@
       <w:tr>
         <w:tc>
           <w:tcPr>
-            <w:tcW w:type="dxa" w:w="2351"/>
+            <w:tcW w:type="dxa" w:w="2158"/>
           </w:tcPr>
           <w:p>
+            <w:pPr>
+              <w:jc w:val="center"/>
+            </w:pPr>
+            <w:r/>
             <w:r>
               <w:rPr>
-                <w:sz w:val="20"/>
+                <w:rFonts w:ascii="宋体" w:hAnsi="宋体" w:eastAsia="宋体"/>
+                <w:sz w:val="21"/>
               </w:rPr>
               <w:t>材料切换</w:t>
             </w:r>
@@ -2533,12 +2813,17 @@
         </w:tc>
         <w:tc>
           <w:tcPr>
-            <w:tcW w:type="dxa" w:w="2351"/>
+            <w:tcW w:type="dxa" w:w="2158"/>
           </w:tcPr>
           <w:p>
+            <w:pPr>
+              <w:jc w:val="center"/>
+            </w:pPr>
+            <w:r/>
             <w:r>
               <w:rPr>
-                <w:sz w:val="20"/>
+                <w:rFonts w:ascii="宋体" w:hAnsi="宋体" w:eastAsia="宋体"/>
+                <w:sz w:val="21"/>
               </w:rPr>
               <w:t>TiO₂→a-Si 颜色变化</w:t>
             </w:r>
@@ -2546,12 +2831,17 @@
         </w:tc>
         <w:tc>
           <w:tcPr>
-            <w:tcW w:type="dxa" w:w="2351"/>
+            <w:tcW w:type="dxa" w:w="2158"/>
           </w:tcPr>
           <w:p>
+            <w:pPr>
+              <w:jc w:val="center"/>
+            </w:pPr>
+            <w:r/>
             <w:r>
               <w:rPr>
-                <w:sz w:val="20"/>
+                <w:rFonts w:ascii="宋体" w:hAnsi="宋体" w:eastAsia="宋体"/>
+                <w:sz w:val="21"/>
               </w:rPr>
               <w:t>TiO₂偏黄，a-Si偏红/蓝</w:t>
             </w:r>
@@ -2559,12 +2849,17 @@
         </w:tc>
         <w:tc>
           <w:tcPr>
-            <w:tcW w:type="dxa" w:w="2351"/>
+            <w:tcW w:type="dxa" w:w="2158"/>
           </w:tcPr>
           <w:p>
+            <w:pPr>
+              <w:jc w:val="center"/>
+            </w:pPr>
+            <w:r/>
             <w:r>
               <w:rPr>
-                <w:sz w:val="20"/>
+                <w:rFonts w:ascii="宋体" w:hAnsi="宋体" w:eastAsia="宋体"/>
+                <w:sz w:val="21"/>
               </w:rPr>
               <w:t>✓</w:t>
             </w:r>
@@ -2574,12 +2869,17 @@
       <w:tr>
         <w:tc>
           <w:tcPr>
-            <w:tcW w:type="dxa" w:w="2351"/>
+            <w:tcW w:type="dxa" w:w="2158"/>
           </w:tcPr>
           <w:p>
+            <w:pPr>
+              <w:jc w:val="center"/>
+            </w:pPr>
+            <w:r/>
             <w:r>
               <w:rPr>
-                <w:sz w:val="20"/>
+                <w:rFonts w:ascii="宋体" w:hAnsi="宋体" w:eastAsia="宋体"/>
+                <w:sz w:val="21"/>
               </w:rPr>
               <w:t>ML代理开关</w:t>
             </w:r>
@@ -2587,25 +2887,35 @@
         </w:tc>
         <w:tc>
           <w:tcPr>
-            <w:tcW w:type="dxa" w:w="2351"/>
+            <w:tcW w:type="dxa" w:w="2158"/>
           </w:tcPr>
           <w:p>
+            <w:pPr>
+              <w:jc w:val="center"/>
+            </w:pPr>
+            <w:r/>
             <w:r>
               <w:rPr>
-                <w:sz w:val="20"/>
+                <w:rFonts w:ascii="宋体" w:hAnsi="宋体" w:eastAsia="宋体"/>
+                <w:sz w:val="21"/>
               </w:rPr>
-              <w:t>物理模型↔ML模型切换</w:t>
+              <w:t>物理✔ML模型切换</w:t>
             </w:r>
           </w:p>
         </w:tc>
         <w:tc>
           <w:tcPr>
-            <w:tcW w:type="dxa" w:w="2351"/>
+            <w:tcW w:type="dxa" w:w="2158"/>
           </w:tcPr>
           <w:p>
+            <w:pPr>
+              <w:jc w:val="center"/>
+            </w:pPr>
+            <w:r/>
             <w:r>
               <w:rPr>
-                <w:sz w:val="20"/>
+                <w:rFonts w:ascii="宋体" w:hAnsi="宋体" w:eastAsia="宋体"/>
+                <w:sz w:val="21"/>
               </w:rPr>
               <w:t>色差波动 &lt; ΔE 3</w:t>
             </w:r>
@@ -2613,12 +2923,17 @@
         </w:tc>
         <w:tc>
           <w:tcPr>
-            <w:tcW w:type="dxa" w:w="2351"/>
+            <w:tcW w:type="dxa" w:w="2158"/>
           </w:tcPr>
           <w:p>
+            <w:pPr>
+              <w:jc w:val="center"/>
+            </w:pPr>
+            <w:r/>
             <w:r>
               <w:rPr>
-                <w:sz w:val="20"/>
+                <w:rFonts w:ascii="宋体" w:hAnsi="宋体" w:eastAsia="宋体"/>
+                <w:sz w:val="21"/>
               </w:rPr>
               <w:t>✓</w:t>
             </w:r>
@@ -2628,12 +2943,17 @@
       <w:tr>
         <w:tc>
           <w:tcPr>
-            <w:tcW w:type="dxa" w:w="2351"/>
+            <w:tcW w:type="dxa" w:w="2158"/>
           </w:tcPr>
           <w:p>
+            <w:pPr>
+              <w:jc w:val="center"/>
+            </w:pPr>
+            <w:r/>
             <w:r>
               <w:rPr>
-                <w:sz w:val="20"/>
+                <w:rFonts w:ascii="宋体" w:hAnsi="宋体" w:eastAsia="宋体"/>
+                <w:sz w:val="21"/>
               </w:rPr>
               <w:t>网格搜索逆设计</w:t>
             </w:r>
@@ -2641,38 +2961,53 @@
         </w:tc>
         <w:tc>
           <w:tcPr>
-            <w:tcW w:type="dxa" w:w="2351"/>
+            <w:tcW w:type="dxa" w:w="2158"/>
           </w:tcPr>
           <w:p>
+            <w:pPr>
+              <w:jc w:val="center"/>
+            </w:pPr>
+            <w:r/>
             <w:r>
               <w:rPr>
-                <w:sz w:val="20"/>
+                <w:rFonts w:ascii="宋体" w:hAnsi="宋体" w:eastAsia="宋体"/>
+                <w:sz w:val="21"/>
               </w:rPr>
-              <w:t>输出Top3匹配结果</w:t>
+              <w:t>输出 Top3 匹配结果</w:t>
             </w:r>
           </w:p>
         </w:tc>
         <w:tc>
           <w:tcPr>
-            <w:tcW w:type="dxa" w:w="2351"/>
+            <w:tcW w:type="dxa" w:w="2158"/>
           </w:tcPr>
           <w:p>
+            <w:pPr>
+              <w:jc w:val="center"/>
+            </w:pPr>
+            <w:r/>
             <w:r>
               <w:rPr>
-                <w:sz w:val="20"/>
+                <w:rFonts w:ascii="宋体" w:hAnsi="宋体" w:eastAsia="宋体"/>
+                <w:sz w:val="21"/>
               </w:rPr>
-              <w:t>搜索8000+组合，&lt; 5秒</w:t>
+              <w:t>搜索 8000+ 组合，&lt; 5秒</w:t>
             </w:r>
           </w:p>
         </w:tc>
         <w:tc>
           <w:tcPr>
-            <w:tcW w:type="dxa" w:w="2351"/>
+            <w:tcW w:type="dxa" w:w="2158"/>
           </w:tcPr>
           <w:p>
+            <w:pPr>
+              <w:jc w:val="center"/>
+            </w:pPr>
+            <w:r/>
             <w:r>
               <w:rPr>
-                <w:sz w:val="20"/>
+                <w:rFonts w:ascii="宋体" w:hAnsi="宋体" w:eastAsia="宋体"/>
+                <w:sz w:val="21"/>
               </w:rPr>
               <w:t>✓</w:t>
             </w:r>
@@ -2682,12 +3017,17 @@
       <w:tr>
         <w:tc>
           <w:tcPr>
-            <w:tcW w:type="dxa" w:w="2351"/>
+            <w:tcW w:type="dxa" w:w="2158"/>
           </w:tcPr>
           <w:p>
+            <w:pPr>
+              <w:jc w:val="center"/>
+            </w:pPr>
+            <w:r/>
             <w:r>
               <w:rPr>
-                <w:sz w:val="20"/>
+                <w:rFonts w:ascii="宋体" w:hAnsi="宋体" w:eastAsia="宋体"/>
+                <w:sz w:val="21"/>
               </w:rPr>
               <w:t>双柱自动搜索</w:t>
             </w:r>
@@ -2695,12 +3035,17 @@
         </w:tc>
         <w:tc>
           <w:tcPr>
-            <w:tcW w:type="dxa" w:w="2351"/>
+            <w:tcW w:type="dxa" w:w="2158"/>
           </w:tcPr>
           <w:p>
+            <w:pPr>
+              <w:jc w:val="center"/>
+            </w:pPr>
+            <w:r/>
             <w:r>
               <w:rPr>
-                <w:sz w:val="20"/>
+                <w:rFonts w:ascii="宋体" w:hAnsi="宋体" w:eastAsia="宋体"/>
+                <w:sz w:val="21"/>
               </w:rPr>
               <w:t>Tensor优化逆设计</w:t>
             </w:r>
@@ -2708,12 +3053,17 @@
         </w:tc>
         <w:tc>
           <w:tcPr>
-            <w:tcW w:type="dxa" w:w="2351"/>
+            <w:tcW w:type="dxa" w:w="2158"/>
           </w:tcPr>
           <w:p>
+            <w:pPr>
+              <w:jc w:val="center"/>
+            </w:pPr>
+            <w:r/>
             <w:r>
               <w:rPr>
-                <w:sz w:val="20"/>
+                <w:rFonts w:ascii="宋体" w:hAnsi="宋体" w:eastAsia="宋体"/>
+                <w:sz w:val="21"/>
               </w:rPr>
               <w:t>250轮梯度下降，&lt; 3秒</w:t>
             </w:r>
@@ -2721,12 +3071,17 @@
         </w:tc>
         <w:tc>
           <w:tcPr>
-            <w:tcW w:type="dxa" w:w="2351"/>
+            <w:tcW w:type="dxa" w:w="2158"/>
           </w:tcPr>
           <w:p>
+            <w:pPr>
+              <w:jc w:val="center"/>
+            </w:pPr>
+            <w:r/>
             <w:r>
               <w:rPr>
-                <w:sz w:val="20"/>
+                <w:rFonts w:ascii="宋体" w:hAnsi="宋体" w:eastAsia="宋体"/>
+                <w:sz w:val="21"/>
               </w:rPr>
               <w:t>✓</w:t>
             </w:r>
@@ -2736,12 +3091,17 @@
       <w:tr>
         <w:tc>
           <w:tcPr>
-            <w:tcW w:type="dxa" w:w="2351"/>
+            <w:tcW w:type="dxa" w:w="2158"/>
           </w:tcPr>
           <w:p>
+            <w:pPr>
+              <w:jc w:val="center"/>
+            </w:pPr>
+            <w:r/>
             <w:r>
               <w:rPr>
-                <w:sz w:val="20"/>
+                <w:rFonts w:ascii="宋体" w:hAnsi="宋体" w:eastAsia="宋体"/>
+                <w:sz w:val="21"/>
               </w:rPr>
               <w:t>FP腔模式</w:t>
             </w:r>
@@ -2749,12 +3109,17 @@
         </w:tc>
         <w:tc>
           <w:tcPr>
-            <w:tcW w:type="dxa" w:w="2351"/>
+            <w:tcW w:type="dxa" w:w="2158"/>
           </w:tcPr>
           <w:p>
+            <w:pPr>
+              <w:jc w:val="center"/>
+            </w:pPr>
+            <w:r/>
             <w:r>
               <w:rPr>
-                <w:sz w:val="20"/>
+                <w:rFonts w:ascii="宋体" w:hAnsi="宋体" w:eastAsia="宋体"/>
+                <w:sz w:val="21"/>
               </w:rPr>
               <w:t>DBR+金属腔颜色计算</w:t>
             </w:r>
@@ -2762,12 +3127,17 @@
         </w:tc>
         <w:tc>
           <w:tcPr>
-            <w:tcW w:type="dxa" w:w="2351"/>
+            <w:tcW w:type="dxa" w:w="2158"/>
           </w:tcPr>
           <w:p>
+            <w:pPr>
+              <w:jc w:val="center"/>
+            </w:pPr>
+            <w:r/>
             <w:r>
               <w:rPr>
-                <w:sz w:val="20"/>
+                <w:rFonts w:ascii="宋体" w:hAnsi="宋体" w:eastAsia="宋体"/>
+                <w:sz w:val="21"/>
               </w:rPr>
               <w:t>高饱和度共振色</w:t>
             </w:r>
@@ -2775,12 +3145,17 @@
         </w:tc>
         <w:tc>
           <w:tcPr>
-            <w:tcW w:type="dxa" w:w="2351"/>
+            <w:tcW w:type="dxa" w:w="2158"/>
           </w:tcPr>
           <w:p>
+            <w:pPr>
+              <w:jc w:val="center"/>
+            </w:pPr>
+            <w:r/>
             <w:r>
               <w:rPr>
-                <w:sz w:val="20"/>
+                <w:rFonts w:ascii="宋体" w:hAnsi="宋体" w:eastAsia="宋体"/>
+                <w:sz w:val="21"/>
               </w:rPr>
               <w:t>✓</w:t>
             </w:r>
@@ -2790,12 +3165,17 @@
       <w:tr>
         <w:tc>
           <w:tcPr>
-            <w:tcW w:type="dxa" w:w="2351"/>
+            <w:tcW w:type="dxa" w:w="2158"/>
           </w:tcPr>
           <w:p>
+            <w:pPr>
+              <w:jc w:val="center"/>
+            </w:pPr>
+            <w:r/>
             <w:r>
               <w:rPr>
-                <w:sz w:val="20"/>
+                <w:rFonts w:ascii="宋体" w:hAnsi="宋体" w:eastAsia="宋体"/>
+                <w:sz w:val="21"/>
               </w:rPr>
               <w:t>角谱远场传播</w:t>
             </w:r>
@@ -2803,12 +3183,17 @@
         </w:tc>
         <w:tc>
           <w:tcPr>
-            <w:tcW w:type="dxa" w:w="2351"/>
+            <w:tcW w:type="dxa" w:w="2158"/>
           </w:tcPr>
           <w:p>
+            <w:pPr>
+              <w:jc w:val="center"/>
+            </w:pPr>
+            <w:r/>
             <w:r>
               <w:rPr>
-                <w:sz w:val="20"/>
+                <w:rFonts w:ascii="宋体" w:hAnsi="宋体" w:eastAsia="宋体"/>
+                <w:sz w:val="21"/>
               </w:rPr>
               <w:t>NA/观察角影响颜色</w:t>
             </w:r>
@@ -2816,12 +3201,17 @@
         </w:tc>
         <w:tc>
           <w:tcPr>
-            <w:tcW w:type="dxa" w:w="2351"/>
+            <w:tcW w:type="dxa" w:w="2158"/>
           </w:tcPr>
           <w:p>
+            <w:pPr>
+              <w:jc w:val="center"/>
+            </w:pPr>
+            <w:r/>
             <w:r>
               <w:rPr>
-                <w:sz w:val="20"/>
+                <w:rFonts w:ascii="宋体" w:hAnsi="宋体" w:eastAsia="宋体"/>
+                <w:sz w:val="21"/>
               </w:rPr>
               <w:t>大NA颜色去饱和</w:t>
             </w:r>
@@ -2829,12 +3219,17 @@
         </w:tc>
         <w:tc>
           <w:tcPr>
-            <w:tcW w:type="dxa" w:w="2351"/>
+            <w:tcW w:type="dxa" w:w="2158"/>
           </w:tcPr>
           <w:p>
+            <w:pPr>
+              <w:jc w:val="center"/>
+            </w:pPr>
+            <w:r/>
             <w:r>
               <w:rPr>
-                <w:sz w:val="20"/>
+                <w:rFonts w:ascii="宋体" w:hAnsi="宋体" w:eastAsia="宋体"/>
+                <w:sz w:val="21"/>
               </w:rPr>
               <w:t>✓</w:t>
             </w:r>
@@ -2844,12 +3239,17 @@
       <w:tr>
         <w:tc>
           <w:tcPr>
-            <w:tcW w:type="dxa" w:w="2351"/>
+            <w:tcW w:type="dxa" w:w="2158"/>
           </w:tcPr>
           <w:p>
+            <w:pPr>
+              <w:jc w:val="center"/>
+            </w:pPr>
+            <w:r/>
             <w:r>
               <w:rPr>
-                <w:sz w:val="20"/>
+                <w:rFonts w:ascii="宋体" w:hAnsi="宋体" w:eastAsia="宋体"/>
+                <w:sz w:val="21"/>
               </w:rPr>
               <w:t>AI分析按钮</w:t>
             </w:r>
@@ -2857,12 +3257,17 @@
         </w:tc>
         <w:tc>
           <w:tcPr>
-            <w:tcW w:type="dxa" w:w="2351"/>
+            <w:tcW w:type="dxa" w:w="2158"/>
           </w:tcPr>
           <w:p>
+            <w:pPr>
+              <w:jc w:val="center"/>
+            </w:pPr>
+            <w:r/>
             <w:r>
               <w:rPr>
-                <w:sz w:val="20"/>
+                <w:rFonts w:ascii="宋体" w:hAnsi="宋体" w:eastAsia="宋体"/>
+                <w:sz w:val="21"/>
               </w:rPr>
               <w:t>LLM返回分析文本</w:t>
             </w:r>
@@ -2870,12 +3275,17 @@
         </w:tc>
         <w:tc>
           <w:tcPr>
-            <w:tcW w:type="dxa" w:w="2351"/>
+            <w:tcW w:type="dxa" w:w="2158"/>
           </w:tcPr>
           <w:p>
+            <w:pPr>
+              <w:jc w:val="center"/>
+            </w:pPr>
+            <w:r/>
             <w:r>
               <w:rPr>
-                <w:sz w:val="20"/>
+                <w:rFonts w:ascii="宋体" w:hAnsi="宋体" w:eastAsia="宋体"/>
+                <w:sz w:val="21"/>
               </w:rPr>
               <w:t>2-5秒内返回结果</w:t>
             </w:r>
@@ -2883,12 +3293,17 @@
         </w:tc>
         <w:tc>
           <w:tcPr>
-            <w:tcW w:type="dxa" w:w="2351"/>
+            <w:tcW w:type="dxa" w:w="2158"/>
           </w:tcPr>
           <w:p>
+            <w:pPr>
+              <w:jc w:val="center"/>
+            </w:pPr>
+            <w:r/>
             <w:r>
               <w:rPr>
-                <w:sz w:val="20"/>
+                <w:rFonts w:ascii="宋体" w:hAnsi="宋体" w:eastAsia="宋体"/>
+                <w:sz w:val="21"/>
               </w:rPr>
               <w:t>✓</w:t>
             </w:r>
@@ -2898,12 +3313,17 @@
       <w:tr>
         <w:tc>
           <w:tcPr>
-            <w:tcW w:type="dxa" w:w="2351"/>
+            <w:tcW w:type="dxa" w:w="2158"/>
           </w:tcPr>
           <w:p>
+            <w:pPr>
+              <w:jc w:val="center"/>
+            </w:pPr>
+            <w:r/>
             <w:r>
               <w:rPr>
-                <w:sz w:val="20"/>
+                <w:rFonts w:ascii="宋体" w:hAnsi="宋体" w:eastAsia="宋体"/>
+                <w:sz w:val="21"/>
               </w:rPr>
               <w:t>图案生成</w:t>
             </w:r>
@@ -2911,12 +3331,17 @@
         </w:tc>
         <w:tc>
           <w:tcPr>
-            <w:tcW w:type="dxa" w:w="2351"/>
+            <w:tcW w:type="dxa" w:w="2158"/>
           </w:tcPr>
           <w:p>
+            <w:pPr>
+              <w:jc w:val="center"/>
+            </w:pPr>
+            <w:r/>
             <w:r>
               <w:rPr>
-                <w:sz w:val="20"/>
+                <w:rFonts w:ascii="宋体" w:hAnsi="宋体" w:eastAsia="宋体"/>
+                <w:sz w:val="21"/>
               </w:rPr>
               <w:t>图片→纳米柱阵列</w:t>
             </w:r>
@@ -2924,12 +3349,17 @@
         </w:tc>
         <w:tc>
           <w:tcPr>
-            <w:tcW w:type="dxa" w:w="2351"/>
+            <w:tcW w:type="dxa" w:w="2158"/>
           </w:tcPr>
           <w:p>
+            <w:pPr>
+              <w:jc w:val="center"/>
+            </w:pPr>
+            <w:r/>
             <w:r>
               <w:rPr>
-                <w:sz w:val="20"/>
+                <w:rFonts w:ascii="宋体" w:hAnsi="宋体" w:eastAsia="宋体"/>
+                <w:sz w:val="21"/>
               </w:rPr>
               <w:t>正确匹配像素颜色</w:t>
             </w:r>
@@ -2937,12 +3367,17 @@
         </w:tc>
         <w:tc>
           <w:tcPr>
-            <w:tcW w:type="dxa" w:w="2351"/>
+            <w:tcW w:type="dxa" w:w="2158"/>
           </w:tcPr>
           <w:p>
+            <w:pPr>
+              <w:jc w:val="center"/>
+            </w:pPr>
+            <w:r/>
             <w:r>
               <w:rPr>
-                <w:sz w:val="20"/>
+                <w:rFonts w:ascii="宋体" w:hAnsi="宋体" w:eastAsia="宋体"/>
+                <w:sz w:val="21"/>
               </w:rPr>
               <w:t>✓</w:t>
             </w:r>
@@ -2970,24 +3405,27 @@
         <w:tblLook w:firstColumn="1" w:firstRow="1" w:lastColumn="0" w:lastRow="0" w:noHBand="0" w:noVBand="1" w:val="04A0"/>
       </w:tblPr>
       <w:tblGrid>
-        <w:gridCol w:w="2351"/>
-        <w:gridCol w:w="2351"/>
-        <w:gridCol w:w="2351"/>
-        <w:gridCol w:w="2351"/>
+        <w:gridCol w:w="2158"/>
+        <w:gridCol w:w="2158"/>
+        <w:gridCol w:w="2158"/>
+        <w:gridCol w:w="2158"/>
       </w:tblGrid>
       <w:tr>
         <w:tc>
           <w:tcPr>
-            <w:tcW w:type="dxa" w:w="2351"/>
+            <w:tcW w:type="dxa" w:w="2158"/>
+            <w:shd w:fill="D9E2F3"/>
           </w:tcPr>
           <w:p>
             <w:pPr>
               <w:jc w:val="center"/>
             </w:pPr>
+            <w:r/>
             <w:r>
               <w:rPr>
+                <w:rFonts w:ascii="宋体" w:hAnsi="宋体" w:eastAsia="宋体"/>
                 <w:b/>
-                <w:sz w:val="20"/>
+                <w:sz w:val="21"/>
               </w:rPr>
               <w:t>指标</w:t>
             </w:r>
@@ -2995,16 +3433,19 @@
         </w:tc>
         <w:tc>
           <w:tcPr>
-            <w:tcW w:type="dxa" w:w="2351"/>
+            <w:tcW w:type="dxa" w:w="2158"/>
+            <w:shd w:fill="D9E2F3"/>
           </w:tcPr>
           <w:p>
             <w:pPr>
               <w:jc w:val="center"/>
             </w:pPr>
+            <w:r/>
             <w:r>
               <w:rPr>
+                <w:rFonts w:ascii="宋体" w:hAnsi="宋体" w:eastAsia="宋体"/>
                 <w:b/>
-                <w:sz w:val="20"/>
+                <w:sz w:val="21"/>
               </w:rPr>
               <w:t>物理模型</w:t>
             </w:r>
@@ -3012,16 +3453,19 @@
         </w:tc>
         <w:tc>
           <w:tcPr>
-            <w:tcW w:type="dxa" w:w="2351"/>
+            <w:tcW w:type="dxa" w:w="2158"/>
+            <w:shd w:fill="D9E2F3"/>
           </w:tcPr>
           <w:p>
             <w:pPr>
               <w:jc w:val="center"/>
             </w:pPr>
+            <w:r/>
             <w:r>
               <w:rPr>
+                <w:rFonts w:ascii="宋体" w:hAnsi="宋体" w:eastAsia="宋体"/>
                 <w:b/>
-                <w:sz w:val="20"/>
+                <w:sz w:val="21"/>
               </w:rPr>
               <w:t>ML模型 (ONNX)</w:t>
             </w:r>
@@ -3029,16 +3473,19 @@
         </w:tc>
         <w:tc>
           <w:tcPr>
-            <w:tcW w:type="dxa" w:w="2351"/>
+            <w:tcW w:type="dxa" w:w="2158"/>
+            <w:shd w:fill="D9E2F3"/>
           </w:tcPr>
           <w:p>
             <w:pPr>
               <w:jc w:val="center"/>
             </w:pPr>
+            <w:r/>
             <w:r>
               <w:rPr>
+                <w:rFonts w:ascii="宋体" w:hAnsi="宋体" w:eastAsia="宋体"/>
                 <w:b/>
-                <w:sz w:val="20"/>
+                <w:sz w:val="21"/>
               </w:rPr>
               <w:t>备注</w:t>
             </w:r>
@@ -3048,12 +3495,17 @@
       <w:tr>
         <w:tc>
           <w:tcPr>
-            <w:tcW w:type="dxa" w:w="2351"/>
+            <w:tcW w:type="dxa" w:w="2158"/>
           </w:tcPr>
           <w:p>
+            <w:pPr>
+              <w:jc w:val="center"/>
+            </w:pPr>
+            <w:r/>
             <w:r>
               <w:rPr>
-                <w:sz w:val="20"/>
+                <w:rFonts w:ascii="宋体" w:hAnsi="宋体" w:eastAsia="宋体"/>
+                <w:sz w:val="21"/>
               </w:rPr>
               <w:t>单次推理延迟</w:t>
             </w:r>
@@ -3061,12 +3513,17 @@
         </w:tc>
         <w:tc>
           <w:tcPr>
-            <w:tcW w:type="dxa" w:w="2351"/>
+            <w:tcW w:type="dxa" w:w="2158"/>
           </w:tcPr>
           <w:p>
+            <w:pPr>
+              <w:jc w:val="center"/>
+            </w:pPr>
+            <w:r/>
             <w:r>
               <w:rPr>
-                <w:sz w:val="20"/>
+                <w:rFonts w:ascii="宋体" w:hAnsi="宋体" w:eastAsia="宋体"/>
+                <w:sz w:val="21"/>
               </w:rPr>
               <w:t>~1 ms</w:t>
             </w:r>
@@ -3074,12 +3531,17 @@
         </w:tc>
         <w:tc>
           <w:tcPr>
-            <w:tcW w:type="dxa" w:w="2351"/>
+            <w:tcW w:type="dxa" w:w="2158"/>
           </w:tcPr>
           <w:p>
+            <w:pPr>
+              <w:jc w:val="center"/>
+            </w:pPr>
+            <w:r/>
             <w:r>
               <w:rPr>
-                <w:sz w:val="20"/>
+                <w:rFonts w:ascii="宋体" w:hAnsi="宋体" w:eastAsia="宋体"/>
+                <w:sz w:val="21"/>
               </w:rPr>
               <w:t>~0.5 ms</w:t>
             </w:r>
@@ -3087,12 +3549,17 @@
         </w:tc>
         <w:tc>
           <w:tcPr>
-            <w:tcW w:type="dxa" w:w="2351"/>
+            <w:tcW w:type="dxa" w:w="2158"/>
           </w:tcPr>
           <w:p>
+            <w:pPr>
+              <w:jc w:val="center"/>
+            </w:pPr>
+            <w:r/>
             <w:r>
               <w:rPr>
-                <w:sz w:val="20"/>
+                <w:rFonts w:ascii="宋体" w:hAnsi="宋体" w:eastAsia="宋体"/>
+                <w:sz w:val="21"/>
               </w:rPr>
               <w:t>不含 Streamlit 框架开销</w:t>
             </w:r>
@@ -3102,12 +3569,17 @@
       <w:tr>
         <w:tc>
           <w:tcPr>
-            <w:tcW w:type="dxa" w:w="2351"/>
+            <w:tcW w:type="dxa" w:w="2158"/>
           </w:tcPr>
           <w:p>
+            <w:pPr>
+              <w:jc w:val="center"/>
+            </w:pPr>
+            <w:r/>
             <w:r>
               <w:rPr>
-                <w:sz w:val="20"/>
+                <w:rFonts w:ascii="宋体" w:hAnsi="宋体" w:eastAsia="宋体"/>
+                <w:sz w:val="21"/>
               </w:rPr>
               <w:t>网格搜索耗时</w:t>
             </w:r>
@@ -3115,12 +3587,17 @@
         </w:tc>
         <w:tc>
           <w:tcPr>
-            <w:tcW w:type="dxa" w:w="2351"/>
+            <w:tcW w:type="dxa" w:w="2158"/>
           </w:tcPr>
           <w:p>
+            <w:pPr>
+              <w:jc w:val="center"/>
+            </w:pPr>
+            <w:r/>
             <w:r>
               <w:rPr>
-                <w:sz w:val="20"/>
+                <w:rFonts w:ascii="宋体" w:hAnsi="宋体" w:eastAsia="宋体"/>
+                <w:sz w:val="21"/>
               </w:rPr>
               <w:t>~8 sec (8000组合)</w:t>
             </w:r>
@@ -3128,12 +3605,17 @@
         </w:tc>
         <w:tc>
           <w:tcPr>
-            <w:tcW w:type="dxa" w:w="2351"/>
+            <w:tcW w:type="dxa" w:w="2158"/>
           </w:tcPr>
           <w:p>
+            <w:pPr>
+              <w:jc w:val="center"/>
+            </w:pPr>
+            <w:r/>
             <w:r>
               <w:rPr>
-                <w:sz w:val="20"/>
+                <w:rFonts w:ascii="宋体" w:hAnsi="宋体" w:eastAsia="宋体"/>
+                <w:sz w:val="21"/>
               </w:rPr>
               <w:t>~3 sec (8000组合)</w:t>
             </w:r>
@@ -3141,12 +3623,17 @@
         </w:tc>
         <w:tc>
           <w:tcPr>
-            <w:tcW w:type="dxa" w:w="2351"/>
+            <w:tcW w:type="dxa" w:w="2158"/>
           </w:tcPr>
           <w:p>
+            <w:pPr>
+              <w:jc w:val="center"/>
+            </w:pPr>
+            <w:r/>
             <w:r>
               <w:rPr>
-                <w:sz w:val="20"/>
+                <w:rFonts w:ascii="宋体" w:hAnsi="宋体" w:eastAsia="宋体"/>
+                <w:sz w:val="21"/>
               </w:rPr>
               <w:t>含光谱计算+色度转换</w:t>
             </w:r>
@@ -3156,12 +3643,17 @@
       <w:tr>
         <w:tc>
           <w:tcPr>
-            <w:tcW w:type="dxa" w:w="2351"/>
+            <w:tcW w:type="dxa" w:w="2158"/>
           </w:tcPr>
           <w:p>
+            <w:pPr>
+              <w:jc w:val="center"/>
+            </w:pPr>
+            <w:r/>
             <w:r>
               <w:rPr>
-                <w:sz w:val="20"/>
+                <w:rFonts w:ascii="宋体" w:hAnsi="宋体" w:eastAsia="宋体"/>
+                <w:sz w:val="21"/>
               </w:rPr>
               <w:t>双柱自动搜索</w:t>
             </w:r>
@@ -3169,12 +3661,17 @@
         </w:tc>
         <w:tc>
           <w:tcPr>
-            <w:tcW w:type="dxa" w:w="2351"/>
+            <w:tcW w:type="dxa" w:w="2158"/>
           </w:tcPr>
           <w:p>
+            <w:pPr>
+              <w:jc w:val="center"/>
+            </w:pPr>
+            <w:r/>
             <w:r>
               <w:rPr>
-                <w:sz w:val="20"/>
+                <w:rFonts w:ascii="宋体" w:hAnsi="宋体" w:eastAsia="宋体"/>
+                <w:sz w:val="21"/>
               </w:rPr>
               <w:t>不支持</w:t>
             </w:r>
@@ -3182,12 +3679,17 @@
         </w:tc>
         <w:tc>
           <w:tcPr>
-            <w:tcW w:type="dxa" w:w="2351"/>
+            <w:tcW w:type="dxa" w:w="2158"/>
           </w:tcPr>
           <w:p>
+            <w:pPr>
+              <w:jc w:val="center"/>
+            </w:pPr>
+            <w:r/>
             <w:r>
               <w:rPr>
-                <w:sz w:val="20"/>
+                <w:rFonts w:ascii="宋体" w:hAnsi="宋体" w:eastAsia="宋体"/>
+                <w:sz w:val="21"/>
               </w:rPr>
               <w:t>~2 sec (250轮)</w:t>
             </w:r>
@@ -3195,12 +3697,17 @@
         </w:tc>
         <w:tc>
           <w:tcPr>
-            <w:tcW w:type="dxa" w:w="2351"/>
+            <w:tcW w:type="dxa" w:w="2158"/>
           </w:tcPr>
           <w:p>
+            <w:pPr>
+              <w:jc w:val="center"/>
+            </w:pPr>
+            <w:r/>
             <w:r>
               <w:rPr>
-                <w:sz w:val="20"/>
+                <w:rFonts w:ascii="宋体" w:hAnsi="宋体" w:eastAsia="宋体"/>
+                <w:sz w:val="21"/>
               </w:rPr>
               <w:t>PyTorch 梯度下降</w:t>
             </w:r>
@@ -3210,12 +3717,17 @@
       <w:tr>
         <w:tc>
           <w:tcPr>
-            <w:tcW w:type="dxa" w:w="2351"/>
+            <w:tcW w:type="dxa" w:w="2158"/>
           </w:tcPr>
           <w:p>
+            <w:pPr>
+              <w:jc w:val="center"/>
+            </w:pPr>
+            <w:r/>
             <w:r>
               <w:rPr>
-                <w:sz w:val="20"/>
+                <w:rFonts w:ascii="宋体" w:hAnsi="宋体" w:eastAsia="宋体"/>
+                <w:sz w:val="21"/>
               </w:rPr>
               <w:t>模型加载时间</w:t>
             </w:r>
@@ -3223,12 +3735,17 @@
         </w:tc>
         <w:tc>
           <w:tcPr>
-            <w:tcW w:type="dxa" w:w="2351"/>
+            <w:tcW w:type="dxa" w:w="2158"/>
           </w:tcPr>
           <w:p>
+            <w:pPr>
+              <w:jc w:val="center"/>
+            </w:pPr>
+            <w:r/>
             <w:r>
               <w:rPr>
-                <w:sz w:val="20"/>
+                <w:rFonts w:ascii="宋体" w:hAnsi="宋体" w:eastAsia="宋体"/>
+                <w:sz w:val="21"/>
               </w:rPr>
               <w:t>无需加载</w:t>
             </w:r>
@@ -3236,12 +3753,17 @@
         </w:tc>
         <w:tc>
           <w:tcPr>
-            <w:tcW w:type="dxa" w:w="2351"/>
+            <w:tcW w:type="dxa" w:w="2158"/>
           </w:tcPr>
           <w:p>
+            <w:pPr>
+              <w:jc w:val="center"/>
+            </w:pPr>
+            <w:r/>
             <w:r>
               <w:rPr>
-                <w:sz w:val="20"/>
+                <w:rFonts w:ascii="宋体" w:hAnsi="宋体" w:eastAsia="宋体"/>
+                <w:sz w:val="21"/>
               </w:rPr>
               <w:t>~200 ms</w:t>
             </w:r>
@@ -3249,12 +3771,17 @@
         </w:tc>
         <w:tc>
           <w:tcPr>
-            <w:tcW w:type="dxa" w:w="2351"/>
+            <w:tcW w:type="dxa" w:w="2158"/>
           </w:tcPr>
           <w:p>
+            <w:pPr>
+              <w:jc w:val="center"/>
+            </w:pPr>
+            <w:r/>
             <w:r>
               <w:rPr>
-                <w:sz w:val="20"/>
+                <w:rFonts w:ascii="宋体" w:hAnsi="宋体" w:eastAsia="宋体"/>
+                <w:sz w:val="21"/>
               </w:rPr>
               <w:t>ONNX 模型文件约 10MB</w:t>
             </w:r>
@@ -3264,12 +3791,17 @@
       <w:tr>
         <w:tc>
           <w:tcPr>
-            <w:tcW w:type="dxa" w:w="2351"/>
+            <w:tcW w:type="dxa" w:w="2158"/>
           </w:tcPr>
           <w:p>
+            <w:pPr>
+              <w:jc w:val="center"/>
+            </w:pPr>
+            <w:r/>
             <w:r>
               <w:rPr>
-                <w:sz w:val="20"/>
+                <w:rFonts w:ascii="宋体" w:hAnsi="宋体" w:eastAsia="宋体"/>
+                <w:sz w:val="21"/>
               </w:rPr>
               <w:t>内存占用</w:t>
             </w:r>
@@ -3277,12 +3809,17 @@
         </w:tc>
         <w:tc>
           <w:tcPr>
-            <w:tcW w:type="dxa" w:w="2351"/>
+            <w:tcW w:type="dxa" w:w="2158"/>
           </w:tcPr>
           <w:p>
+            <w:pPr>
+              <w:jc w:val="center"/>
+            </w:pPr>
+            <w:r/>
             <w:r>
               <w:rPr>
-                <w:sz w:val="20"/>
+                <w:rFonts w:ascii="宋体" w:hAnsi="宋体" w:eastAsia="宋体"/>
+                <w:sz w:val="21"/>
               </w:rPr>
               <w:t>&lt; 100 MB</w:t>
             </w:r>
@@ -3290,12 +3827,17 @@
         </w:tc>
         <w:tc>
           <w:tcPr>
-            <w:tcW w:type="dxa" w:w="2351"/>
+            <w:tcW w:type="dxa" w:w="2158"/>
           </w:tcPr>
           <w:p>
+            <w:pPr>
+              <w:jc w:val="center"/>
+            </w:pPr>
+            <w:r/>
             <w:r>
               <w:rPr>
-                <w:sz w:val="20"/>
+                <w:rFonts w:ascii="宋体" w:hAnsi="宋体" w:eastAsia="宋体"/>
+                <w:sz w:val="21"/>
               </w:rPr>
               <w:t>&lt; 300 MB</w:t>
             </w:r>
@@ -3303,12 +3845,17 @@
         </w:tc>
         <w:tc>
           <w:tcPr>
-            <w:tcW w:type="dxa" w:w="2351"/>
+            <w:tcW w:type="dxa" w:w="2158"/>
           </w:tcPr>
           <w:p>
+            <w:pPr>
+              <w:jc w:val="center"/>
+            </w:pPr>
+            <w:r/>
             <w:r>
               <w:rPr>
-                <w:sz w:val="20"/>
+                <w:rFonts w:ascii="宋体" w:hAnsi="宋体" w:eastAsia="宋体"/>
+                <w:sz w:val="21"/>
               </w:rPr>
               <w:t>含 ML 模型权重</w:t>
             </w:r>
@@ -3330,7 +3877,7 @@
     </w:p>
     <w:p>
       <w:pPr>
-        <w:ind w:firstLine="425"/>
+        <w:spacing w:line="360" w:lineRule="auto"/>
       </w:pPr>
       <w:r>
         <w:rPr>
@@ -3343,7 +3890,7 @@
     </w:p>
     <w:p>
       <w:pPr>
-        <w:ind w:firstLine="425"/>
+        <w:spacing w:line="360" w:lineRule="auto"/>
       </w:pPr>
       <w:r>
         <w:rPr>
@@ -3356,7 +3903,7 @@
     </w:p>
     <w:p>
       <w:pPr>
-        <w:ind w:firstLine="425"/>
+        <w:spacing w:line="360" w:lineRule="auto"/>
       </w:pPr>
       <w:r>
         <w:rPr>
@@ -3365,6 +3912,11 @@
           <w:sz w:val="24"/>
         </w:rPr>
         <w:t>（3）云端兼容性：代码已部署至 Streamlit Cloud，通过 requirements.txt 精确指定依赖版本，确保云端环境可复现本地运行结果。</w:t>
+      </w:r>
+    </w:p>
+    <w:p>
+      <w:r>
+        <w:br w:type="page"/>
       </w:r>
     </w:p>
     <w:p>
@@ -3391,7 +3943,8 @@
     </w:p>
     <w:p>
       <w:pPr>
-        <w:ind w:firstLine="425"/>
+        <w:spacing w:line="360" w:lineRule="auto"/>
+        <w:ind w:firstLine="420"/>
       </w:pPr>
       <w:r>
         <w:rPr>
@@ -3415,7 +3968,7 @@
     </w:p>
     <w:p>
       <w:pPr>
-        <w:ind w:firstLine="425"/>
+        <w:spacing w:line="360" w:lineRule="auto"/>
       </w:pPr>
       <w:r>
         <w:rPr>
@@ -3428,7 +3981,7 @@
     </w:p>
     <w:p>
       <w:pPr>
-        <w:ind w:firstLine="425"/>
+        <w:spacing w:line="360" w:lineRule="auto"/>
       </w:pPr>
       <w:r>
         <w:rPr>
@@ -3441,7 +3994,7 @@
     </w:p>
     <w:p>
       <w:pPr>
-        <w:ind w:firstLine="425"/>
+        <w:spacing w:line="360" w:lineRule="auto"/>
       </w:pPr>
       <w:r>
         <w:rPr>
@@ -3454,7 +4007,7 @@
     </w:p>
     <w:p>
       <w:pPr>
-        <w:ind w:firstLine="425"/>
+        <w:spacing w:line="360" w:lineRule="auto"/>
       </w:pPr>
       <w:r>
         <w:rPr>
@@ -3478,7 +4031,7 @@
     </w:p>
     <w:p>
       <w:pPr>
-        <w:ind w:firstLine="425"/>
+        <w:spacing w:line="360" w:lineRule="auto"/>
       </w:pPr>
       <w:r>
         <w:rPr>
@@ -3486,12 +4039,12 @@
           <w:b w:val="0"/>
           <w:sz w:val="24"/>
         </w:rPr>
-        <w:t>（1）色域局限：TiO₂ 纳米柱在当前参数范围内无法产生高饱和青蓝色（B&lt;0.45）和纯红色，这是 Lorentzian 共振的物理本质限制。未来可引入更复杂的纳米柱形状（如矩形柱、椭圆柱）来扩展色域。</w:t>
+        <w:t>（1）色域局限：TiO₂ 纳米柱在当前参数范围内无法产生高饱和青蓝色和纯红色，这是 Lorentzian 共振的物理本质限制。未来可引入更复杂的纳米柱形状（如矩形柱、椭圆柱）来扩展色域。</w:t>
       </w:r>
     </w:p>
     <w:p>
       <w:pPr>
-        <w:ind w:firstLine="425"/>
+        <w:spacing w:line="360" w:lineRule="auto"/>
       </w:pPr>
       <w:r>
         <w:rPr>
@@ -3499,12 +4052,12 @@
           <w:b w:val="0"/>
           <w:sz w:val="24"/>
         </w:rPr>
-        <w:t>（2）模型精度：当前 ML 模型基于物理公式生成的合成数据训练，与真实 FDTD/RCWA 仿真结果存在偏差。未来可使用 RCWA 仿真工具（如 meent）生成更高保真度的训练数据。</w:t>
+        <w:t>（2）模型精度：当前 ML 模型基于物理公式生成的合成数据训练，与真实 FDTD/RCWA 仿真结果存在偏差。未来可使用 RCWA 仿真工具生成更高保真度的训练数据。</w:t>
       </w:r>
     </w:p>
     <w:p>
       <w:pPr>
-        <w:ind w:firstLine="425"/>
+        <w:spacing w:line="360" w:lineRule="auto"/>
       </w:pPr>
       <w:r>
         <w:rPr>
@@ -3517,7 +4070,7 @@
     </w:p>
     <w:p>
       <w:pPr>
-        <w:ind w:firstLine="425"/>
+        <w:spacing w:line="360" w:lineRule="auto"/>
       </w:pPr>
       <w:r>
         <w:rPr>
@@ -3526,6 +4079,11 @@
           <w:sz w:val="24"/>
         </w:rPr>
         <w:t>（4）3D 可视化：当前仅支持 2D 纳米柱截面图，未来可集成 3D 渲染引擎实现纳米结构的立体展示。</w:t>
+      </w:r>
+    </w:p>
+    <w:p>
+      <w:r>
+        <w:br w:type="page"/>
       </w:r>
     </w:p>
     <w:p>
@@ -3541,7 +4099,8 @@
     </w:p>
     <w:p>
       <w:pPr>
-        <w:ind w:firstLine="425"/>
+        <w:spacing w:line="360" w:lineRule="auto"/>
+        <w:ind w:firstLine="420"/>
       </w:pPr>
       <w:r>
         <w:rPr>
@@ -3554,74 +4113,21 @@
     </w:p>
     <w:p>
       <w:pPr>
-        <w:ind w:firstLine="425"/>
+        <w:spacing w:line="360" w:lineRule="auto"/>
       </w:pPr>
-      <w:r/>
       <w:r>
         <w:rPr>
           <w:rFonts w:ascii="宋体" w:hAnsi="宋体" w:eastAsia="宋体"/>
           <w:b/>
           <w:sz w:val="24"/>
         </w:rPr>
-        <w:t>C. 云端演示地址（含 AI 分析功能）：</w:t>
+        <w:t>B. 云端演示地址（含 AI 分析功能）：</w:t>
       </w:r>
     </w:p>
     <w:p>
       <w:pPr>
-        <w:ind w:firstLine="425"/>
-      </w:pPr>
-      <w:r>
-        <w:rPr>
-          <w:rFonts w:ascii="宋体" w:hAnsi="宋体" w:eastAsia="宋体"/>
-          <w:b w:val="0"/>
-          <w:sz w:val="24"/>
-        </w:rPr>
-        <w:t>C. 核心参考文献：</w:t>
-      </w:r>
-    </w:p>
-    <w:p>
-      <w:pPr>
-        <w:ind w:firstLine="425"/>
-      </w:pPr>
-      <w:r>
-        <w:rPr>
-          <w:rFonts w:ascii="宋体" w:hAnsi="宋体" w:eastAsia="宋体"/>
-          <w:b w:val="0"/>
-          <w:sz w:val="24"/>
-        </w:rPr>
-        <w:t xml:space="preserve">    [1] Kuznetsov A I, et al. "Optically resonant dielectric nanostructures." Science 354.6314 (2016).</w:t>
-      </w:r>
-    </w:p>
-    <w:p>
-      <w:pPr>
-        <w:ind w:firstLine="425"/>
-      </w:pPr>
-      <w:r>
-        <w:rPr>
-          <w:rFonts w:ascii="宋体" w:hAnsi="宋体" w:eastAsia="宋体"/>
-          <w:b w:val="0"/>
-          <w:sz w:val="24"/>
-        </w:rPr>
-        <w:t xml:space="preserve">    [2] Yang W, et al. "All-dielectric metasurface for high-performance structural color." Nature Communications 11.1 (2020): 1864.</w:t>
-      </w:r>
-    </w:p>
-    <w:p>
-      <w:pPr>
-        <w:ind w:firstLine="425"/>
-      </w:pPr>
-      <w:r>
-        <w:rPr>
-          <w:rFonts w:ascii="宋体" w:hAnsi="宋体" w:eastAsia="宋体"/>
-          <w:b w:val="0"/>
-          <w:sz w:val="24"/>
-        </w:rPr>
-        <w:t xml:space="preserve">    [3] CIE 015:2018, "Colorimetry, 4th Edition." CIE Central Bureau, Vienna (2018).</w:t>
-      </w:r>
-    </w:p>
-    <w:p/>
-    <w:p>
-      <w:pPr>
-        <w:ind w:firstLine="425"/>
+        <w:spacing w:line="360" w:lineRule="auto"/>
+        <w:ind w:firstLine="420"/>
       </w:pPr>
       <w:r>
         <w:rPr>
@@ -3634,7 +4140,8 @@
     </w:p>
     <w:p>
       <w:pPr>
-        <w:ind w:firstLine="425"/>
+        <w:spacing w:line="360" w:lineRule="auto"/>
+        <w:ind w:firstLine="420"/>
       </w:pPr>
       <w:r>
         <w:rPr>
@@ -3642,12 +4149,68 @@
           <w:b w:val="0"/>
           <w:sz w:val="24"/>
         </w:rPr>
-        <w:t>（已预配置 DeepSeek API 密钥，点击界面上方"AI 分析"按钮即可体验大模型功能。）</w:t>
+        <w:t>（已预配置 DeepSeek API 密钥，点击界面上方“AI 分析”按钮即可体验大模型功能。每次分析约消耗 0.001 元。）</w:t>
+      </w:r>
+    </w:p>
+    <w:p>
+      <w:pPr>
+        <w:spacing w:line="360" w:lineRule="auto"/>
+        <w:ind w:firstLine="420"/>
+      </w:pPr>
+      <w:r>
+        <w:rPr>
+          <w:rFonts w:ascii="宋体" w:hAnsi="宋体" w:eastAsia="宋体"/>
+          <w:b/>
+          <w:sz w:val="24"/>
+        </w:rPr>
+        <w:t>C. 核心参考文献：</w:t>
+      </w:r>
+    </w:p>
+    <w:p>
+      <w:pPr>
+        <w:spacing w:line="360" w:lineRule="auto"/>
+        <w:ind w:firstLine="420"/>
+      </w:pPr>
+      <w:r>
+        <w:rPr>
+          <w:rFonts w:ascii="宋体" w:hAnsi="宋体" w:eastAsia="宋体"/>
+          <w:b w:val="0"/>
+          <w:sz w:val="24"/>
+        </w:rPr>
+        <w:t>[1] Kuznetsov A I, et al. "Optically resonant dielectric nanostructures." Science 354.6314 (2016).</w:t>
+      </w:r>
+    </w:p>
+    <w:p>
+      <w:pPr>
+        <w:spacing w:line="360" w:lineRule="auto"/>
+        <w:ind w:firstLine="420"/>
+      </w:pPr>
+      <w:r>
+        <w:rPr>
+          <w:rFonts w:ascii="宋体" w:hAnsi="宋体" w:eastAsia="宋体"/>
+          <w:b w:val="0"/>
+          <w:sz w:val="24"/>
+        </w:rPr>
+        <w:t>[2] Yang W, et al. "All-dielectric metasurface for high-performance structural color." Nature Communications 11.1 (2020): 1864.</w:t>
+      </w:r>
+    </w:p>
+    <w:p>
+      <w:pPr>
+        <w:spacing w:line="360" w:lineRule="auto"/>
+        <w:ind w:firstLine="420"/>
+      </w:pPr>
+      <w:r>
+        <w:rPr>
+          <w:rFonts w:ascii="宋体" w:hAnsi="宋体" w:eastAsia="宋体"/>
+          <w:b w:val="0"/>
+          <w:sz w:val="24"/>
+        </w:rPr>
+        <w:t>[3] CIE 015:2018, "Colorimetry, 4th Edition." CIE Central Bureau, Vienna (2018).</w:t>
       </w:r>
     </w:p>
     <w:sectPr>
       <w:pgSz w:w="12240" w:h="15840"/>
-      <w:pgMar w:top="1417" w:right="1417" w:bottom="1417" w:left="1417" w:header="720" w:footer="720" w:gutter="0"/>
+      <w:pgMar w:top="1440" w:right="1803" w:bottom="1440" w:left="1803" w:header="720" w:footer="720" w:gutter="0"/>
       <w:cols w:space="720"/>
       <w:docGrid w:linePitch="360"/>
     </w:sectPr>
@@ -4018,6 +4581,9 @@
     <w:name w:val="Normal"/>
     <w:qFormat/>
     <w:rsid w:val="00FC693F"/>
+    <w:pPr>
+      <w:spacing w:line="360" w:lineRule="auto" w:after="120"/>
+    </w:pPr>
     <w:rPr>
       <w:rFonts w:ascii="宋体" w:hAnsi="宋体" w:eastAsia="宋体"/>
       <w:sz w:val="24"/>
@@ -4078,15 +4644,15 @@
     <w:pPr>
       <w:keepNext/>
       <w:keepLines/>
-      <w:spacing w:before="480" w:after="0"/>
+      <w:spacing w:before="240" w:after="120" w:line="360" w:lineRule="auto"/>
       <w:outlineLvl w:val="0"/>
     </w:pPr>
     <w:rPr>
-      <w:rFonts w:asciiTheme="majorHAnsi" w:eastAsiaTheme="majorEastAsia" w:hAnsiTheme="majorHAnsi" w:cstheme="majorBidi"/>
+      <w:rFonts w:asciiTheme="majorHAnsi" w:eastAsiaTheme="majorEastAsia" w:hAnsiTheme="majorHAnsi" w:cstheme="majorBidi" w:ascii="黑体" w:hAnsi="黑体" w:eastAsia="黑体"/>
       <w:b/>
       <w:bCs/>
-      <w:color w:val="365F91" w:themeColor="accent1" w:themeShade="BF"/>
-      <w:sz w:val="28"/>
+      <w:color w:val="000000"/>
+      <w:sz w:val="32"/>
       <w:szCs w:val="28"/>
     </w:rPr>
   </w:style>
@@ -4102,15 +4668,15 @@
     <w:pPr>
       <w:keepNext/>
       <w:keepLines/>
-      <w:spacing w:before="200" w:after="0"/>
+      <w:spacing w:before="240" w:after="120" w:line="360" w:lineRule="auto"/>
       <w:outlineLvl w:val="1"/>
     </w:pPr>
     <w:rPr>
-      <w:rFonts w:asciiTheme="majorHAnsi" w:eastAsiaTheme="majorEastAsia" w:hAnsiTheme="majorHAnsi" w:cstheme="majorBidi"/>
+      <w:rFonts w:asciiTheme="majorHAnsi" w:eastAsiaTheme="majorEastAsia" w:hAnsiTheme="majorHAnsi" w:cstheme="majorBidi" w:ascii="黑体" w:hAnsi="黑体" w:eastAsia="黑体"/>
       <w:b/>
       <w:bCs/>
-      <w:color w:val="4F81BD" w:themeColor="accent1"/>
-      <w:sz w:val="26"/>
+      <w:color w:val="000000"/>
+      <w:sz w:val="28"/>
       <w:szCs w:val="26"/>
     </w:rPr>
   </w:style>
@@ -4126,14 +4692,15 @@
     <w:pPr>
       <w:keepNext/>
       <w:keepLines/>
-      <w:spacing w:before="200" w:after="0"/>
+      <w:spacing w:before="240" w:after="120" w:line="360" w:lineRule="auto"/>
       <w:outlineLvl w:val="2"/>
     </w:pPr>
     <w:rPr>
-      <w:rFonts w:asciiTheme="majorHAnsi" w:eastAsiaTheme="majorEastAsia" w:hAnsiTheme="majorHAnsi" w:cstheme="majorBidi"/>
+      <w:rFonts w:asciiTheme="majorHAnsi" w:eastAsiaTheme="majorEastAsia" w:hAnsiTheme="majorHAnsi" w:cstheme="majorBidi" w:ascii="黑体" w:hAnsi="黑体" w:eastAsia="黑体"/>
       <w:b/>
       <w:bCs/>
-      <w:color w:val="4F81BD" w:themeColor="accent1"/>
+      <w:color w:val="000000"/>
+      <w:sz w:val="26"/>
     </w:rPr>
   </w:style>
   <w:style w:type="paragraph" w:styleId="Heading4">

</xml_diff>

<commit_message>
报告: 参考文献+3( Roberts/de Souza/Sadman)
</commit_message>
<xml_diff>
--- a/AI超表面结构色设计_项目报告.docx
+++ b/AI超表面结构色设计_项目报告.docx
@@ -6175,6 +6175,42 @@
         <w:t>lorimetry, 4th Edition." CIE Central Bureau, Vienna (2018).</w:t>
       </w:r>
     </w:p>
+    <w:p>
+      <w:pPr>
+        <w:spacing w:line="360" w:lineRule="auto"/>
+        <w:ind w:firstLine="420"/>
+        <w:jc w:val="both"/>
+      </w:pPr>
+      <w:bookmarkStart w:id="0" w:name="_GoBack"/>
+      <w:bookmarkEnd w:id="0"/>
+      <w:r>
+        <w:t xml:space="preserve">[4] Roberts N B, Hedayati M K. "A deep learning approach to the forward prediction and inverse design of plasmonic metasurface structural color." Applied Physics Letters 119.7 (2021): 071101.</w:t>
+      </w:r>
+    </w:p>
+    <w:p>
+      <w:pPr>
+        <w:spacing w:line="360" w:lineRule="auto"/>
+        <w:ind w:firstLine="420"/>
+        <w:jc w:val="both"/>
+      </w:pPr>
+      <w:bookmarkStart w:id="0" w:name="_GoBack"/>
+      <w:bookmarkEnd w:id="0"/>
+      <w:r>
+        <w:t xml:space="preserve">[5] de Souza A C, et al. "Back-Propagation Optimization and Multi-Valued Artificial Neural Networks for Highly Vivid Structural Color Filter Metasurfaces." arXiv:2310.01324 (2023).</w:t>
+      </w:r>
+    </w:p>
+    <w:p>
+      <w:pPr>
+        <w:spacing w:line="360" w:lineRule="auto"/>
+        <w:ind w:firstLine="420"/>
+        <w:jc w:val="both"/>
+      </w:pPr>
+      <w:bookmarkStart w:id="0" w:name="_GoBack"/>
+      <w:bookmarkEnd w:id="0"/>
+      <w:r>
+        <w:t xml:space="preserve">[6] Sadman S, et al. "Deep neural network for color prediction from a dielectric metasurface and inverse design of corresponding color filter." Optical Materials Express 15.3 (2025): 567.</w:t>
+      </w:r>
+    </w:p>
     <w:sectPr>
       <w:headerReference r:id="rId5" w:type="default"/>
       <w:footerReference r:id="rId6" w:type="default"/>

</xml_diff>